<commit_message>
added mako to requirement and tcl error catch
</commit_message>
<xml_diff>
--- a/docs/public/HDL Workflow Hands-On Guide.docx
+++ b/docs/public/HDL Workflow Hands-On Guide.docx
@@ -77,7 +77,7 @@
           <w:r>
             <w:fldChar w:fldCharType="separate"/>
           </w:r>
-          <w:hyperlink w:anchor="_Toc210041306" w:history="1">
+          <w:hyperlink w:anchor="_Toc210048113" w:history="1">
             <w:r>
               <w:rPr>
                 <w:rStyle w:val="Hyperlink"/>
@@ -97,7 +97,21 @@
                 <w:rStyle w:val="Hyperlink"/>
                 <w:noProof/>
               </w:rPr>
-              <w:t>Getting Started</w:t>
+              <w:t>Gettin</w:t>
+            </w:r>
+            <w:r>
+              <w:rPr>
+                <w:rStyle w:val="Hyperlink"/>
+                <w:noProof/>
+              </w:rPr>
+              <w:t>g</w:t>
+            </w:r>
+            <w:r>
+              <w:rPr>
+                <w:rStyle w:val="Hyperlink"/>
+                <w:noProof/>
+              </w:rPr>
+              <w:t xml:space="preserve"> Started</w:t>
             </w:r>
             <w:r>
               <w:rPr>
@@ -118,7 +132,7 @@
                 <w:noProof/>
                 <w:webHidden/>
               </w:rPr>
-              <w:instrText xml:space="preserve"> PAGEREF _Toc210041306 \h </w:instrText>
+              <w:instrText xml:space="preserve"> PAGEREF _Toc210048113 \h </w:instrText>
             </w:r>
             <w:r>
               <w:rPr>
@@ -161,7 +175,7 @@
               <w:noProof/>
             </w:rPr>
           </w:pPr>
-          <w:hyperlink w:anchor="_Toc210041307" w:history="1">
+          <w:hyperlink w:anchor="_Toc210048114" w:history="1">
             <w:r>
               <w:rPr>
                 <w:rStyle w:val="Hyperlink"/>
@@ -202,7 +216,7 @@
                 <w:noProof/>
                 <w:webHidden/>
               </w:rPr>
-              <w:instrText xml:space="preserve"> PAGEREF _Toc210041307 \h </w:instrText>
+              <w:instrText xml:space="preserve"> PAGEREF _Toc210048114 \h </w:instrText>
             </w:r>
             <w:r>
               <w:rPr>
@@ -245,7 +259,7 @@
               <w:noProof/>
             </w:rPr>
           </w:pPr>
-          <w:hyperlink w:anchor="_Toc210041308" w:history="1">
+          <w:hyperlink w:anchor="_Toc210048115" w:history="1">
             <w:r>
               <w:rPr>
                 <w:rStyle w:val="Hyperlink"/>
@@ -286,7 +300,7 @@
                 <w:noProof/>
                 <w:webHidden/>
               </w:rPr>
-              <w:instrText xml:space="preserve"> PAGEREF _Toc210041308 \h </w:instrText>
+              <w:instrText xml:space="preserve"> PAGEREF _Toc210048115 \h </w:instrText>
             </w:r>
             <w:r>
               <w:rPr>
@@ -329,7 +343,7 @@
               <w:noProof/>
             </w:rPr>
           </w:pPr>
-          <w:hyperlink w:anchor="_Toc210041309" w:history="1">
+          <w:hyperlink w:anchor="_Toc210048116" w:history="1">
             <w:r>
               <w:rPr>
                 <w:rStyle w:val="Hyperlink"/>
@@ -370,7 +384,7 @@
                 <w:noProof/>
                 <w:webHidden/>
               </w:rPr>
-              <w:instrText xml:space="preserve"> PAGEREF _Toc210041309 \h </w:instrText>
+              <w:instrText xml:space="preserve"> PAGEREF _Toc210048116 \h </w:instrText>
             </w:r>
             <w:r>
               <w:rPr>
@@ -413,7 +427,7 @@
               <w:noProof/>
             </w:rPr>
           </w:pPr>
-          <w:hyperlink w:anchor="_Toc210041310" w:history="1">
+          <w:hyperlink w:anchor="_Toc210048117" w:history="1">
             <w:r>
               <w:rPr>
                 <w:rStyle w:val="Hyperlink"/>
@@ -454,7 +468,7 @@
                 <w:noProof/>
                 <w:webHidden/>
               </w:rPr>
-              <w:instrText xml:space="preserve"> PAGEREF _Toc210041310 \h </w:instrText>
+              <w:instrText xml:space="preserve"> PAGEREF _Toc210048117 \h </w:instrText>
             </w:r>
             <w:r>
               <w:rPr>
@@ -497,7 +511,7 @@
               <w:noProof/>
             </w:rPr>
           </w:pPr>
-          <w:hyperlink w:anchor="_Toc210041311" w:history="1">
+          <w:hyperlink w:anchor="_Toc210048118" w:history="1">
             <w:r>
               <w:rPr>
                 <w:rStyle w:val="Hyperlink"/>
@@ -538,7 +552,7 @@
                 <w:noProof/>
                 <w:webHidden/>
               </w:rPr>
-              <w:instrText xml:space="preserve"> PAGEREF _Toc210041311 \h </w:instrText>
+              <w:instrText xml:space="preserve"> PAGEREF _Toc210048118 \h </w:instrText>
             </w:r>
             <w:r>
               <w:rPr>
@@ -581,7 +595,7 @@
               <w:noProof/>
             </w:rPr>
           </w:pPr>
-          <w:hyperlink w:anchor="_Toc210041312" w:history="1">
+          <w:hyperlink w:anchor="_Toc210048119" w:history="1">
             <w:r>
               <w:rPr>
                 <w:rStyle w:val="Hyperlink"/>
@@ -622,7 +636,7 @@
                 <w:noProof/>
                 <w:webHidden/>
               </w:rPr>
-              <w:instrText xml:space="preserve"> PAGEREF _Toc210041312 \h </w:instrText>
+              <w:instrText xml:space="preserve"> PAGEREF _Toc210048119 \h </w:instrText>
             </w:r>
             <w:r>
               <w:rPr>
@@ -665,7 +679,7 @@
               <w:noProof/>
             </w:rPr>
           </w:pPr>
-          <w:hyperlink w:anchor="_Toc210041313" w:history="1">
+          <w:hyperlink w:anchor="_Toc210048120" w:history="1">
             <w:r>
               <w:rPr>
                 <w:rStyle w:val="Hyperlink"/>
@@ -706,7 +720,7 @@
                 <w:noProof/>
                 <w:webHidden/>
               </w:rPr>
-              <w:instrText xml:space="preserve"> PAGEREF _Toc210041313 \h </w:instrText>
+              <w:instrText xml:space="preserve"> PAGEREF _Toc210048120 \h </w:instrText>
             </w:r>
             <w:r>
               <w:rPr>
@@ -749,7 +763,7 @@
               <w:noProof/>
             </w:rPr>
           </w:pPr>
-          <w:hyperlink w:anchor="_Toc210041314" w:history="1">
+          <w:hyperlink w:anchor="_Toc210048121" w:history="1">
             <w:r>
               <w:rPr>
                 <w:rStyle w:val="Hyperlink"/>
@@ -790,7 +804,7 @@
                 <w:noProof/>
                 <w:webHidden/>
               </w:rPr>
-              <w:instrText xml:space="preserve"> PAGEREF _Toc210041314 \h </w:instrText>
+              <w:instrText xml:space="preserve"> PAGEREF _Toc210048121 \h </w:instrText>
             </w:r>
             <w:r>
               <w:rPr>
@@ -833,7 +847,7 @@
               <w:noProof/>
             </w:rPr>
           </w:pPr>
-          <w:hyperlink w:anchor="_Toc210041315" w:history="1">
+          <w:hyperlink w:anchor="_Toc210048122" w:history="1">
             <w:r>
               <w:rPr>
                 <w:rStyle w:val="Hyperlink"/>
@@ -874,7 +888,7 @@
                 <w:noProof/>
                 <w:webHidden/>
               </w:rPr>
-              <w:instrText xml:space="preserve"> PAGEREF _Toc210041315 \h </w:instrText>
+              <w:instrText xml:space="preserve"> PAGEREF _Toc210048122 \h </w:instrText>
             </w:r>
             <w:r>
               <w:rPr>
@@ -917,7 +931,7 @@
               <w:noProof/>
             </w:rPr>
           </w:pPr>
-          <w:hyperlink w:anchor="_Toc210041316" w:history="1">
+          <w:hyperlink w:anchor="_Toc210048123" w:history="1">
             <w:r>
               <w:rPr>
                 <w:rStyle w:val="Hyperlink"/>
@@ -958,7 +972,7 @@
                 <w:noProof/>
                 <w:webHidden/>
               </w:rPr>
-              <w:instrText xml:space="preserve"> PAGEREF _Toc210041316 \h </w:instrText>
+              <w:instrText xml:space="preserve"> PAGEREF _Toc210048123 \h </w:instrText>
             </w:r>
             <w:r>
               <w:rPr>
@@ -1001,7 +1015,7 @@
               <w:noProof/>
             </w:rPr>
           </w:pPr>
-          <w:hyperlink w:anchor="_Toc210041317" w:history="1">
+          <w:hyperlink w:anchor="_Toc210048124" w:history="1">
             <w:r>
               <w:rPr>
                 <w:rStyle w:val="Hyperlink"/>
@@ -1042,7 +1056,7 @@
                 <w:noProof/>
                 <w:webHidden/>
               </w:rPr>
-              <w:instrText xml:space="preserve"> PAGEREF _Toc210041317 \h </w:instrText>
+              <w:instrText xml:space="preserve"> PAGEREF _Toc210048124 \h </w:instrText>
             </w:r>
             <w:r>
               <w:rPr>
@@ -1085,7 +1099,7 @@
               <w:noProof/>
             </w:rPr>
           </w:pPr>
-          <w:hyperlink w:anchor="_Toc210041318" w:history="1">
+          <w:hyperlink w:anchor="_Toc210048125" w:history="1">
             <w:r>
               <w:rPr>
                 <w:rStyle w:val="Hyperlink"/>
@@ -1126,7 +1140,7 @@
                 <w:noProof/>
                 <w:webHidden/>
               </w:rPr>
-              <w:instrText xml:space="preserve"> PAGEREF _Toc210041318 \h </w:instrText>
+              <w:instrText xml:space="preserve"> PAGEREF _Toc210048125 \h </w:instrText>
             </w:r>
             <w:r>
               <w:rPr>
@@ -1169,7 +1183,7 @@
               <w:noProof/>
             </w:rPr>
           </w:pPr>
-          <w:hyperlink w:anchor="_Toc210041319" w:history="1">
+          <w:hyperlink w:anchor="_Toc210048126" w:history="1">
             <w:r>
               <w:rPr>
                 <w:rStyle w:val="Hyperlink"/>
@@ -1210,7 +1224,7 @@
                 <w:noProof/>
                 <w:webHidden/>
               </w:rPr>
-              <w:instrText xml:space="preserve"> PAGEREF _Toc210041319 \h </w:instrText>
+              <w:instrText xml:space="preserve"> PAGEREF _Toc210048126 \h </w:instrText>
             </w:r>
             <w:r>
               <w:rPr>
@@ -1253,7 +1267,7 @@
               <w:noProof/>
             </w:rPr>
           </w:pPr>
-          <w:hyperlink w:anchor="_Toc210041320" w:history="1">
+          <w:hyperlink w:anchor="_Toc210048127" w:history="1">
             <w:r>
               <w:rPr>
                 <w:rStyle w:val="Hyperlink"/>
@@ -1294,7 +1308,7 @@
                 <w:noProof/>
                 <w:webHidden/>
               </w:rPr>
-              <w:instrText xml:space="preserve"> PAGEREF _Toc210041320 \h </w:instrText>
+              <w:instrText xml:space="preserve"> PAGEREF _Toc210048127 \h </w:instrText>
             </w:r>
             <w:r>
               <w:rPr>
@@ -1337,7 +1351,7 @@
               <w:noProof/>
             </w:rPr>
           </w:pPr>
-          <w:hyperlink w:anchor="_Toc210041321" w:history="1">
+          <w:hyperlink w:anchor="_Toc210048128" w:history="1">
             <w:r>
               <w:rPr>
                 <w:rStyle w:val="Hyperlink"/>
@@ -1378,7 +1392,7 @@
                 <w:noProof/>
                 <w:webHidden/>
               </w:rPr>
-              <w:instrText xml:space="preserve"> PAGEREF _Toc210041321 \h </w:instrText>
+              <w:instrText xml:space="preserve"> PAGEREF _Toc210048128 \h </w:instrText>
             </w:r>
             <w:r>
               <w:rPr>
@@ -1421,7 +1435,7 @@
               <w:noProof/>
             </w:rPr>
           </w:pPr>
-          <w:hyperlink w:anchor="_Toc210041322" w:history="1">
+          <w:hyperlink w:anchor="_Toc210048129" w:history="1">
             <w:r>
               <w:rPr>
                 <w:rStyle w:val="Hyperlink"/>
@@ -1462,7 +1476,7 @@
                 <w:noProof/>
                 <w:webHidden/>
               </w:rPr>
-              <w:instrText xml:space="preserve"> PAGEREF _Toc210041322 \h </w:instrText>
+              <w:instrText xml:space="preserve"> PAGEREF _Toc210048129 \h </w:instrText>
             </w:r>
             <w:r>
               <w:rPr>
@@ -1505,7 +1519,7 @@
               <w:noProof/>
             </w:rPr>
           </w:pPr>
-          <w:hyperlink w:anchor="_Toc210041323" w:history="1">
+          <w:hyperlink w:anchor="_Toc210048130" w:history="1">
             <w:r>
               <w:rPr>
                 <w:rStyle w:val="Hyperlink"/>
@@ -1546,7 +1560,7 @@
                 <w:noProof/>
                 <w:webHidden/>
               </w:rPr>
-              <w:instrText xml:space="preserve"> PAGEREF _Toc210041323 \h </w:instrText>
+              <w:instrText xml:space="preserve"> PAGEREF _Toc210048130 \h </w:instrText>
             </w:r>
             <w:r>
               <w:rPr>
@@ -1589,7 +1603,7 @@
               <w:noProof/>
             </w:rPr>
           </w:pPr>
-          <w:hyperlink w:anchor="_Toc210041324" w:history="1">
+          <w:hyperlink w:anchor="_Toc210048131" w:history="1">
             <w:r>
               <w:rPr>
                 <w:rStyle w:val="Hyperlink"/>
@@ -1630,7 +1644,7 @@
                 <w:noProof/>
                 <w:webHidden/>
               </w:rPr>
-              <w:instrText xml:space="preserve"> PAGEREF _Toc210041324 \h </w:instrText>
+              <w:instrText xml:space="preserve"> PAGEREF _Toc210048131 \h </w:instrText>
             </w:r>
             <w:r>
               <w:rPr>
@@ -1673,7 +1687,7 @@
               <w:noProof/>
             </w:rPr>
           </w:pPr>
-          <w:hyperlink w:anchor="_Toc210041325" w:history="1">
+          <w:hyperlink w:anchor="_Toc210048132" w:history="1">
             <w:r>
               <w:rPr>
                 <w:rStyle w:val="Hyperlink"/>
@@ -1714,7 +1728,7 @@
                 <w:noProof/>
                 <w:webHidden/>
               </w:rPr>
-              <w:instrText xml:space="preserve"> PAGEREF _Toc210041325 \h </w:instrText>
+              <w:instrText xml:space="preserve"> PAGEREF _Toc210048132 \h </w:instrText>
             </w:r>
             <w:r>
               <w:rPr>
@@ -1757,7 +1771,7 @@
               <w:noProof/>
             </w:rPr>
           </w:pPr>
-          <w:hyperlink w:anchor="_Toc210041326" w:history="1">
+          <w:hyperlink w:anchor="_Toc210048133" w:history="1">
             <w:r>
               <w:rPr>
                 <w:rStyle w:val="Hyperlink"/>
@@ -1798,7 +1812,7 @@
                 <w:noProof/>
                 <w:webHidden/>
               </w:rPr>
-              <w:instrText xml:space="preserve"> PAGEREF _Toc210041326 \h </w:instrText>
+              <w:instrText xml:space="preserve"> PAGEREF _Toc210048133 \h </w:instrText>
             </w:r>
             <w:r>
               <w:rPr>
@@ -1841,7 +1855,7 @@
               <w:noProof/>
             </w:rPr>
           </w:pPr>
-          <w:hyperlink w:anchor="_Toc210041327" w:history="1">
+          <w:hyperlink w:anchor="_Toc210048134" w:history="1">
             <w:r>
               <w:rPr>
                 <w:rStyle w:val="Hyperlink"/>
@@ -1882,7 +1896,7 @@
                 <w:noProof/>
                 <w:webHidden/>
               </w:rPr>
-              <w:instrText xml:space="preserve"> PAGEREF _Toc210041327 \h </w:instrText>
+              <w:instrText xml:space="preserve"> PAGEREF _Toc210048134 \h </w:instrText>
             </w:r>
             <w:r>
               <w:rPr>
@@ -1925,7 +1939,7 @@
               <w:noProof/>
             </w:rPr>
           </w:pPr>
-          <w:hyperlink w:anchor="_Toc210041328" w:history="1">
+          <w:hyperlink w:anchor="_Toc210048135" w:history="1">
             <w:r>
               <w:rPr>
                 <w:rStyle w:val="Hyperlink"/>
@@ -1966,7 +1980,7 @@
                 <w:noProof/>
                 <w:webHidden/>
               </w:rPr>
-              <w:instrText xml:space="preserve"> PAGEREF _Toc210041328 \h </w:instrText>
+              <w:instrText xml:space="preserve"> PAGEREF _Toc210048135 \h </w:instrText>
             </w:r>
             <w:r>
               <w:rPr>
@@ -2009,7 +2023,7 @@
               <w:noProof/>
             </w:rPr>
           </w:pPr>
-          <w:hyperlink w:anchor="_Toc210041329" w:history="1">
+          <w:hyperlink w:anchor="_Toc210048136" w:history="1">
             <w:r>
               <w:rPr>
                 <w:rStyle w:val="Hyperlink"/>
@@ -2050,7 +2064,7 @@
                 <w:noProof/>
                 <w:webHidden/>
               </w:rPr>
-              <w:instrText xml:space="preserve"> PAGEREF _Toc210041329 \h </w:instrText>
+              <w:instrText xml:space="preserve"> PAGEREF _Toc210048136 \h </w:instrText>
             </w:r>
             <w:r>
               <w:rPr>
@@ -2093,7 +2107,7 @@
               <w:noProof/>
             </w:rPr>
           </w:pPr>
-          <w:hyperlink w:anchor="_Toc210041330" w:history="1">
+          <w:hyperlink w:anchor="_Toc210048137" w:history="1">
             <w:r>
               <w:rPr>
                 <w:rStyle w:val="Hyperlink"/>
@@ -2134,7 +2148,7 @@
                 <w:noProof/>
                 <w:webHidden/>
               </w:rPr>
-              <w:instrText xml:space="preserve"> PAGEREF _Toc210041330 \h </w:instrText>
+              <w:instrText xml:space="preserve"> PAGEREF _Toc210048137 \h </w:instrText>
             </w:r>
             <w:r>
               <w:rPr>
@@ -2177,7 +2191,7 @@
               <w:noProof/>
             </w:rPr>
           </w:pPr>
-          <w:hyperlink w:anchor="_Toc210041331" w:history="1">
+          <w:hyperlink w:anchor="_Toc210048138" w:history="1">
             <w:r>
               <w:rPr>
                 <w:rStyle w:val="Hyperlink"/>
@@ -2218,7 +2232,7 @@
                 <w:noProof/>
                 <w:webHidden/>
               </w:rPr>
-              <w:instrText xml:space="preserve"> PAGEREF _Toc210041331 \h </w:instrText>
+              <w:instrText xml:space="preserve"> PAGEREF _Toc210048138 \h </w:instrText>
             </w:r>
             <w:r>
               <w:rPr>
@@ -2261,7 +2275,7 @@
               <w:noProof/>
             </w:rPr>
           </w:pPr>
-          <w:hyperlink w:anchor="_Toc210041332" w:history="1">
+          <w:hyperlink w:anchor="_Toc210048139" w:history="1">
             <w:r>
               <w:rPr>
                 <w:rStyle w:val="Hyperlink"/>
@@ -2302,7 +2316,7 @@
                 <w:noProof/>
                 <w:webHidden/>
               </w:rPr>
-              <w:instrText xml:space="preserve"> PAGEREF _Toc210041332 \h </w:instrText>
+              <w:instrText xml:space="preserve"> PAGEREF _Toc210048139 \h </w:instrText>
             </w:r>
             <w:r>
               <w:rPr>
@@ -2345,7 +2359,7 @@
               <w:noProof/>
             </w:rPr>
           </w:pPr>
-          <w:hyperlink w:anchor="_Toc210041333" w:history="1">
+          <w:hyperlink w:anchor="_Toc210048140" w:history="1">
             <w:r>
               <w:rPr>
                 <w:rStyle w:val="Hyperlink"/>
@@ -2386,7 +2400,7 @@
                 <w:noProof/>
                 <w:webHidden/>
               </w:rPr>
-              <w:instrText xml:space="preserve"> PAGEREF _Toc210041333 \h </w:instrText>
+              <w:instrText xml:space="preserve"> PAGEREF _Toc210048140 \h </w:instrText>
             </w:r>
             <w:r>
               <w:rPr>
@@ -2429,7 +2443,7 @@
               <w:noProof/>
             </w:rPr>
           </w:pPr>
-          <w:hyperlink w:anchor="_Toc210041334" w:history="1">
+          <w:hyperlink w:anchor="_Toc210048141" w:history="1">
             <w:r>
               <w:rPr>
                 <w:rStyle w:val="Hyperlink"/>
@@ -2470,7 +2484,7 @@
                 <w:noProof/>
                 <w:webHidden/>
               </w:rPr>
-              <w:instrText xml:space="preserve"> PAGEREF _Toc210041334 \h </w:instrText>
+              <w:instrText xml:space="preserve"> PAGEREF _Toc210048141 \h </w:instrText>
             </w:r>
             <w:r>
               <w:rPr>
@@ -2513,7 +2527,7 @@
               <w:noProof/>
             </w:rPr>
           </w:pPr>
-          <w:hyperlink w:anchor="_Toc210041335" w:history="1">
+          <w:hyperlink w:anchor="_Toc210048142" w:history="1">
             <w:r>
               <w:rPr>
                 <w:rStyle w:val="Hyperlink"/>
@@ -2554,7 +2568,7 @@
                 <w:noProof/>
                 <w:webHidden/>
               </w:rPr>
-              <w:instrText xml:space="preserve"> PAGEREF _Toc210041335 \h </w:instrText>
+              <w:instrText xml:space="preserve"> PAGEREF _Toc210048142 \h </w:instrText>
             </w:r>
             <w:r>
               <w:rPr>
@@ -2597,7 +2611,7 @@
               <w:noProof/>
             </w:rPr>
           </w:pPr>
-          <w:hyperlink w:anchor="_Toc210041336" w:history="1">
+          <w:hyperlink w:anchor="_Toc210048143" w:history="1">
             <w:r>
               <w:rPr>
                 <w:rStyle w:val="Hyperlink"/>
@@ -2638,7 +2652,7 @@
                 <w:noProof/>
                 <w:webHidden/>
               </w:rPr>
-              <w:instrText xml:space="preserve"> PAGEREF _Toc210041336 \h </w:instrText>
+              <w:instrText xml:space="preserve"> PAGEREF _Toc210048143 \h </w:instrText>
             </w:r>
             <w:r>
               <w:rPr>
@@ -2681,7 +2695,7 @@
               <w:noProof/>
             </w:rPr>
           </w:pPr>
-          <w:hyperlink w:anchor="_Toc210041337" w:history="1">
+          <w:hyperlink w:anchor="_Toc210048144" w:history="1">
             <w:r>
               <w:rPr>
                 <w:rStyle w:val="Hyperlink"/>
@@ -2722,7 +2736,7 @@
                 <w:noProof/>
                 <w:webHidden/>
               </w:rPr>
-              <w:instrText xml:space="preserve"> PAGEREF _Toc210041337 \h </w:instrText>
+              <w:instrText xml:space="preserve"> PAGEREF _Toc210048144 \h </w:instrText>
             </w:r>
             <w:r>
               <w:rPr>
@@ -2765,7 +2779,7 @@
               <w:noProof/>
             </w:rPr>
           </w:pPr>
-          <w:hyperlink w:anchor="_Toc210041338" w:history="1">
+          <w:hyperlink w:anchor="_Toc210048145" w:history="1">
             <w:r>
               <w:rPr>
                 <w:rStyle w:val="Hyperlink"/>
@@ -2806,7 +2820,7 @@
                 <w:noProof/>
                 <w:webHidden/>
               </w:rPr>
-              <w:instrText xml:space="preserve"> PAGEREF _Toc210041338 \h </w:instrText>
+              <w:instrText xml:space="preserve"> PAGEREF _Toc210048145 \h </w:instrText>
             </w:r>
             <w:r>
               <w:rPr>
@@ -2849,7 +2863,7 @@
               <w:noProof/>
             </w:rPr>
           </w:pPr>
-          <w:hyperlink w:anchor="_Toc210041339" w:history="1">
+          <w:hyperlink w:anchor="_Toc210048146" w:history="1">
             <w:r>
               <w:rPr>
                 <w:rStyle w:val="Hyperlink"/>
@@ -2890,7 +2904,7 @@
                 <w:noProof/>
                 <w:webHidden/>
               </w:rPr>
-              <w:instrText xml:space="preserve"> PAGEREF _Toc210041339 \h </w:instrText>
+              <w:instrText xml:space="preserve"> PAGEREF _Toc210048146 \h </w:instrText>
             </w:r>
             <w:r>
               <w:rPr>
@@ -2933,7 +2947,7 @@
               <w:noProof/>
             </w:rPr>
           </w:pPr>
-          <w:hyperlink w:anchor="_Toc210041340" w:history="1">
+          <w:hyperlink w:anchor="_Toc210048147" w:history="1">
             <w:r>
               <w:rPr>
                 <w:rStyle w:val="Hyperlink"/>
@@ -2974,7 +2988,7 @@
                 <w:noProof/>
                 <w:webHidden/>
               </w:rPr>
-              <w:instrText xml:space="preserve"> PAGEREF _Toc210041340 \h </w:instrText>
+              <w:instrText xml:space="preserve"> PAGEREF _Toc210048147 \h </w:instrText>
             </w:r>
             <w:r>
               <w:rPr>
@@ -3017,7 +3031,7 @@
               <w:noProof/>
             </w:rPr>
           </w:pPr>
-          <w:hyperlink w:anchor="_Toc210041341" w:history="1">
+          <w:hyperlink w:anchor="_Toc210048148" w:history="1">
             <w:r>
               <w:rPr>
                 <w:rStyle w:val="Hyperlink"/>
@@ -3058,7 +3072,7 @@
                 <w:noProof/>
                 <w:webHidden/>
               </w:rPr>
-              <w:instrText xml:space="preserve"> PAGEREF _Toc210041341 \h </w:instrText>
+              <w:instrText xml:space="preserve"> PAGEREF _Toc210048148 \h </w:instrText>
             </w:r>
             <w:r>
               <w:rPr>
@@ -3101,7 +3115,7 @@
               <w:noProof/>
             </w:rPr>
           </w:pPr>
-          <w:hyperlink w:anchor="_Toc210041342" w:history="1">
+          <w:hyperlink w:anchor="_Toc210048149" w:history="1">
             <w:r>
               <w:rPr>
                 <w:rStyle w:val="Hyperlink"/>
@@ -3142,7 +3156,7 @@
                 <w:noProof/>
                 <w:webHidden/>
               </w:rPr>
-              <w:instrText xml:space="preserve"> PAGEREF _Toc210041342 \h </w:instrText>
+              <w:instrText xml:space="preserve"> PAGEREF _Toc210048149 \h </w:instrText>
             </w:r>
             <w:r>
               <w:rPr>
@@ -3185,7 +3199,7 @@
               <w:noProof/>
             </w:rPr>
           </w:pPr>
-          <w:hyperlink w:anchor="_Toc210041343" w:history="1">
+          <w:hyperlink w:anchor="_Toc210048150" w:history="1">
             <w:r>
               <w:rPr>
                 <w:rStyle w:val="Hyperlink"/>
@@ -3226,7 +3240,7 @@
                 <w:noProof/>
                 <w:webHidden/>
               </w:rPr>
-              <w:instrText xml:space="preserve"> PAGEREF _Toc210041343 \h </w:instrText>
+              <w:instrText xml:space="preserve"> PAGEREF _Toc210048150 \h </w:instrText>
             </w:r>
             <w:r>
               <w:rPr>
@@ -3269,7 +3283,7 @@
               <w:noProof/>
             </w:rPr>
           </w:pPr>
-          <w:hyperlink w:anchor="_Toc210041344" w:history="1">
+          <w:hyperlink w:anchor="_Toc210048151" w:history="1">
             <w:r>
               <w:rPr>
                 <w:rStyle w:val="Hyperlink"/>
@@ -3310,7 +3324,7 @@
                 <w:noProof/>
                 <w:webHidden/>
               </w:rPr>
-              <w:instrText xml:space="preserve"> PAGEREF _Toc210041344 \h </w:instrText>
+              <w:instrText xml:space="preserve"> PAGEREF _Toc210048151 \h </w:instrText>
             </w:r>
             <w:r>
               <w:rPr>
@@ -3370,7 +3384,7 @@
       <w:pPr>
         <w:pStyle w:val="Heading1"/>
       </w:pPr>
-      <w:bookmarkStart w:id="0" w:name="_Toc210041306"/>
+      <w:bookmarkStart w:id="0" w:name="_Toc210048113"/>
       <w:r>
         <w:lastRenderedPageBreak/>
         <w:t>Getting Started</w:t>
@@ -3620,7 +3634,7 @@
       <w:pPr>
         <w:pStyle w:val="Heading1"/>
       </w:pPr>
-      <w:bookmarkStart w:id="1" w:name="_Toc210041307"/>
+      <w:bookmarkStart w:id="1" w:name="_Toc210048114"/>
       <w:r>
         <w:lastRenderedPageBreak/>
         <w:t>System Setup</w:t>
@@ -3635,7 +3649,122 @@
       <w:pPr>
         <w:pStyle w:val="Heading2"/>
       </w:pPr>
-      <w:bookmarkStart w:id="2" w:name="_Toc210041308"/>
+      <w:bookmarkStart w:id="2" w:name="_Toc210048115"/>
+      <w:r>
+        <w:t>Install Git</w:t>
+      </w:r>
+    </w:p>
+    <w:p>
+      <w:r>
+        <w:t xml:space="preserve">Go to: </w:t>
+      </w:r>
+      <w:hyperlink r:id="rId9" w:history="1">
+        <w:r>
+          <w:rPr>
+            <w:rStyle w:val="Hyperlink"/>
+          </w:rPr>
+          <w:t>https://git-scm.com/downloads</w:t>
+        </w:r>
+      </w:hyperlink>
+    </w:p>
+    <w:p>
+      <w:r>
+        <w:t>Install the latest version</w:t>
+      </w:r>
+    </w:p>
+    <w:p/>
+    <w:p>
+      <w:pPr>
+        <w:pStyle w:val="Heading2"/>
+      </w:pPr>
+      <w:r>
+        <w:t>Install Python</w:t>
+      </w:r>
+    </w:p>
+    <w:p>
+      <w:r>
+        <w:t xml:space="preserve">Go to: </w:t>
+      </w:r>
+      <w:hyperlink r:id="rId10" w:history="1">
+        <w:r>
+          <w:rPr>
+            <w:rStyle w:val="Hyperlink"/>
+          </w:rPr>
+          <w:t>https://www.python.org/downloads/</w:t>
+        </w:r>
+      </w:hyperlink>
+    </w:p>
+    <w:p>
+      <w:r>
+        <w:t>Install the latest version</w:t>
+      </w:r>
+    </w:p>
+    <w:p>
+      <w:r>
+        <w:t xml:space="preserve">If you are using </w:t>
+      </w:r>
+      <w:proofErr w:type="spellStart"/>
+      <w:r>
+        <w:t>PyEnv</w:t>
+      </w:r>
+      <w:proofErr w:type="spellEnd"/>
+      <w:r>
+        <w:t>, configure it to use 3.11 or newer</w:t>
+      </w:r>
+    </w:p>
+    <w:p/>
+    <w:p>
+      <w:pPr>
+        <w:pStyle w:val="Heading2"/>
+      </w:pPr>
+      <w:r>
+        <w:t xml:space="preserve">Create </w:t>
+      </w:r>
+      <w:r>
+        <w:t xml:space="preserve">a GitHub </w:t>
+      </w:r>
+      <w:r>
+        <w:t>development folder</w:t>
+      </w:r>
+    </w:p>
+    <w:p>
+      <w:r>
+        <w:t xml:space="preserve">Create a GitHub development folder on your computer: </w:t>
+      </w:r>
+    </w:p>
+    <w:p>
+      <w:pPr>
+        <w:rPr>
+          <w:rFonts w:ascii="Consolas" w:hAnsi="Consolas"/>
+          <w:color w:val="3A7C22" w:themeColor="accent6" w:themeShade="BF"/>
+          <w:sz w:val="22"/>
+          <w:szCs w:val="22"/>
+        </w:rPr>
+      </w:pPr>
+      <w:r>
+        <w:rPr>
+          <w:rFonts w:ascii="Consolas" w:hAnsi="Consolas"/>
+          <w:color w:val="3A7C22" w:themeColor="accent6" w:themeShade="BF"/>
+          <w:sz w:val="22"/>
+          <w:szCs w:val="22"/>
+        </w:rPr>
+        <w:t>c:\dev\github</w:t>
+      </w:r>
+    </w:p>
+    <w:p>
+      <w:pPr>
+        <w:rPr>
+          <w:rFonts w:ascii="Consolas" w:hAnsi="Consolas"/>
+          <w:color w:val="3A7C22" w:themeColor="accent6" w:themeShade="BF"/>
+          <w:sz w:val="22"/>
+          <w:szCs w:val="22"/>
+        </w:rPr>
+      </w:pPr>
+    </w:p>
+    <w:p>
+      <w:pPr>
+        <w:pStyle w:val="Heading2"/>
+      </w:pPr>
       <w:r>
         <w:t>Clone the base FlexRIO repo</w:t>
       </w:r>
@@ -3643,13 +3772,42 @@
     </w:p>
     <w:p>
       <w:r>
-        <w:t xml:space="preserve">Create a </w:t>
-      </w:r>
-      <w:r>
-        <w:t xml:space="preserve">GitHub development </w:t>
-      </w:r>
-      <w:r>
-        <w:t>folder on your computer:</w:t>
+        <w:t>Open a command prompt in that folder and clone the repo:</w:t>
+      </w:r>
+    </w:p>
+    <w:p>
+      <w:pPr>
+        <w:rPr>
+          <w:rFonts w:ascii="Consolas" w:hAnsi="Consolas"/>
+          <w:color w:val="7030A0"/>
+          <w:sz w:val="22"/>
+          <w:szCs w:val="22"/>
+        </w:rPr>
+      </w:pPr>
+      <w:r>
+        <w:rPr>
+          <w:rFonts w:ascii="Consolas" w:hAnsi="Consolas"/>
+          <w:color w:val="7030A0"/>
+          <w:sz w:val="22"/>
+          <w:szCs w:val="22"/>
+        </w:rPr>
+        <w:t>git clone https://github.com/ni/flexrio</w:t>
+      </w:r>
+    </w:p>
+    <w:p/>
+    <w:p>
+      <w:pPr>
+        <w:pStyle w:val="Heading2"/>
+      </w:pPr>
+      <w:bookmarkStart w:id="3" w:name="_Toc210048116"/>
+      <w:r>
+        <w:t>Install the LabVIEW FPGA HDL Tools</w:t>
+      </w:r>
+      <w:bookmarkEnd w:id="3"/>
+    </w:p>
+    <w:p>
+      <w:r>
+        <w:t>Open a command prompt in the PXIe-7903 target folder:</w:t>
       </w:r>
     </w:p>
     <w:p>
@@ -3670,11 +3828,20 @@
         </w:rPr>
         <w:t>C:\dev\github</w:t>
       </w:r>
+      <w:r>
+        <w:rPr>
+          <w:rFonts w:ascii="Consolas" w:hAnsi="Consolas"/>
+          <w:color w:val="3A7C22" w:themeColor="accent6" w:themeShade="BF"/>
+          <w:sz w:val="22"/>
+          <w:szCs w:val="22"/>
+        </w:rPr>
+        <w:t>\flexrio\targets\pxie-7903</w:t>
+      </w:r>
     </w:p>
     <w:p/>
     <w:p>
       <w:r>
-        <w:t>Open a command prompt in that folder and clone the repo:</w:t>
+        <w:t>Run the install command:</w:t>
       </w:r>
     </w:p>
     <w:p>
@@ -3693,7 +3860,7 @@
           <w:sz w:val="22"/>
           <w:szCs w:val="22"/>
         </w:rPr>
-        <w:t>git clone https://github.com/ni/flexrio</w:t>
+        <w:t>pip install -r requirements.txt</w:t>
       </w:r>
     </w:p>
     <w:p/>
@@ -3701,77 +3868,9 @@
       <w:pPr>
         <w:pStyle w:val="Heading2"/>
       </w:pPr>
-      <w:bookmarkStart w:id="3" w:name="_Toc210041309"/>
-      <w:r>
-        <w:t>Install the LabVIEW FPGA HDL Tools</w:t>
-      </w:r>
-      <w:bookmarkEnd w:id="3"/>
-    </w:p>
-    <w:p>
-      <w:r>
-        <w:t>Open a command prompt in the PXIe-7903 target folder:</w:t>
-      </w:r>
-    </w:p>
-    <w:p>
-      <w:pPr>
-        <w:rPr>
-          <w:rFonts w:ascii="Consolas" w:hAnsi="Consolas"/>
-          <w:color w:val="3A7C22" w:themeColor="accent6" w:themeShade="BF"/>
-          <w:sz w:val="22"/>
-          <w:szCs w:val="22"/>
-        </w:rPr>
-      </w:pPr>
-      <w:r>
-        <w:rPr>
-          <w:rFonts w:ascii="Consolas" w:hAnsi="Consolas"/>
-          <w:color w:val="3A7C22" w:themeColor="accent6" w:themeShade="BF"/>
-          <w:sz w:val="22"/>
-          <w:szCs w:val="22"/>
-        </w:rPr>
-        <w:t>C:\dev\github</w:t>
-      </w:r>
-      <w:r>
-        <w:rPr>
-          <w:rFonts w:ascii="Consolas" w:hAnsi="Consolas"/>
-          <w:color w:val="3A7C22" w:themeColor="accent6" w:themeShade="BF"/>
-          <w:sz w:val="22"/>
-          <w:szCs w:val="22"/>
-        </w:rPr>
-        <w:t>\flexrio\targets\pxie-7903</w:t>
-      </w:r>
-    </w:p>
-    <w:p/>
-    <w:p>
-      <w:r>
-        <w:t>Run the install command:</w:t>
-      </w:r>
-    </w:p>
-    <w:p>
-      <w:pPr>
-        <w:rPr>
-          <w:rFonts w:ascii="Consolas" w:hAnsi="Consolas"/>
-          <w:color w:val="7030A0"/>
-          <w:sz w:val="22"/>
-          <w:szCs w:val="22"/>
-        </w:rPr>
-      </w:pPr>
-      <w:r>
-        <w:rPr>
-          <w:rFonts w:ascii="Consolas" w:hAnsi="Consolas"/>
-          <w:color w:val="7030A0"/>
-          <w:sz w:val="22"/>
-          <w:szCs w:val="22"/>
-        </w:rPr>
-        <w:t>pip install -r requirements.txt</w:t>
-      </w:r>
-    </w:p>
-    <w:p/>
-    <w:p>
-      <w:pPr>
-        <w:pStyle w:val="Heading2"/>
-      </w:pPr>
-      <w:bookmarkStart w:id="4" w:name="_Toc210041310"/>
-      <w:r>
+      <w:bookmarkStart w:id="4" w:name="_Toc210048117"/>
+      <w:r>
+        <w:lastRenderedPageBreak/>
         <w:t>Install Dependencies</w:t>
       </w:r>
       <w:bookmarkEnd w:id="4"/>
@@ -3782,7 +3881,7 @@
       </w:r>
     </w:p>
     <w:p>
-      <w:hyperlink r:id="rId9" w:history="1">
+      <w:hyperlink r:id="rId11" w:history="1">
         <w:r>
           <w:rPr>
             <w:rStyle w:val="Hyperlink"/>
@@ -3854,6 +3953,183 @@
           <w:sz w:val="22"/>
           <w:szCs w:val="22"/>
         </w:rPr>
+        <w:t>nihdl</w:t>
+      </w:r>
+      <w:proofErr w:type="spellEnd"/>
+      <w:r>
+        <w:rPr>
+          <w:rFonts w:ascii="Consolas" w:hAnsi="Consolas"/>
+          <w:color w:val="7030A0"/>
+          <w:sz w:val="22"/>
+          <w:szCs w:val="22"/>
+        </w:rPr>
+        <w:t xml:space="preserve"> extract-deps</w:t>
+      </w:r>
+    </w:p>
+    <w:p/>
+    <w:p>
+      <w:pPr>
+        <w:pStyle w:val="Heading2"/>
+      </w:pPr>
+      <w:bookmarkStart w:id="5" w:name="_Toc210048118"/>
+      <w:r>
+        <w:t>Create and Synthesize the Vivado Project</w:t>
+      </w:r>
+      <w:bookmarkEnd w:id="5"/>
+    </w:p>
+    <w:p>
+      <w:r>
+        <w:t>These steps will ensure that the GitHub repo and tools are properly setup.  Additionally, there are some files generated by the create-project command that are used in later steps.</w:t>
+      </w:r>
+    </w:p>
+    <w:p/>
+    <w:p>
+      <w:r>
+        <w:t>Run the create-project command:</w:t>
+      </w:r>
+    </w:p>
+    <w:p>
+      <w:pPr>
+        <w:rPr>
+          <w:rFonts w:ascii="Consolas" w:hAnsi="Consolas"/>
+          <w:color w:val="7030A0"/>
+          <w:sz w:val="22"/>
+          <w:szCs w:val="22"/>
+        </w:rPr>
+      </w:pPr>
+      <w:proofErr w:type="spellStart"/>
+      <w:r>
+        <w:rPr>
+          <w:rFonts w:ascii="Consolas" w:hAnsi="Consolas"/>
+          <w:color w:val="7030A0"/>
+          <w:sz w:val="22"/>
+          <w:szCs w:val="22"/>
+        </w:rPr>
+        <w:t>nihdl</w:t>
+      </w:r>
+      <w:proofErr w:type="spellEnd"/>
+      <w:r>
+        <w:rPr>
+          <w:rFonts w:ascii="Consolas" w:hAnsi="Consolas"/>
+          <w:color w:val="7030A0"/>
+          <w:sz w:val="22"/>
+          <w:szCs w:val="22"/>
+        </w:rPr>
+        <w:t xml:space="preserve"> create-project</w:t>
+      </w:r>
+    </w:p>
+    <w:p/>
+    <w:p>
+      <w:r>
+        <w:t>Run the launch-</w:t>
+      </w:r>
+      <w:proofErr w:type="spellStart"/>
+      <w:r>
+        <w:t>vivado</w:t>
+      </w:r>
+      <w:proofErr w:type="spellEnd"/>
+      <w:r>
+        <w:t xml:space="preserve"> command:</w:t>
+      </w:r>
+    </w:p>
+    <w:p>
+      <w:pPr>
+        <w:rPr>
+          <w:rFonts w:ascii="Consolas" w:hAnsi="Consolas"/>
+          <w:color w:val="7030A0"/>
+          <w:sz w:val="22"/>
+          <w:szCs w:val="22"/>
+        </w:rPr>
+      </w:pPr>
+      <w:proofErr w:type="spellStart"/>
+      <w:r>
+        <w:rPr>
+          <w:rFonts w:ascii="Consolas" w:hAnsi="Consolas"/>
+          <w:color w:val="7030A0"/>
+          <w:sz w:val="22"/>
+          <w:szCs w:val="22"/>
+        </w:rPr>
+        <w:t>nihdl</w:t>
+      </w:r>
+      <w:proofErr w:type="spellEnd"/>
+      <w:r>
+        <w:rPr>
+          <w:rFonts w:ascii="Consolas" w:hAnsi="Consolas"/>
+          <w:color w:val="7030A0"/>
+          <w:sz w:val="22"/>
+          <w:szCs w:val="22"/>
+        </w:rPr>
+        <w:t xml:space="preserve"> launch-</w:t>
+      </w:r>
+      <w:proofErr w:type="spellStart"/>
+      <w:r>
+        <w:rPr>
+          <w:rFonts w:ascii="Consolas" w:hAnsi="Consolas"/>
+          <w:color w:val="7030A0"/>
+          <w:sz w:val="22"/>
+          <w:szCs w:val="22"/>
+        </w:rPr>
+        <w:t>vivado</w:t>
+      </w:r>
+      <w:proofErr w:type="spellEnd"/>
+    </w:p>
+    <w:p>
+      <w:pPr>
+        <w:rPr>
+          <w:rFonts w:ascii="Consolas" w:hAnsi="Consolas"/>
+          <w:color w:val="0070C0"/>
+          <w:sz w:val="22"/>
+          <w:szCs w:val="22"/>
+        </w:rPr>
+      </w:pPr>
+    </w:p>
+    <w:p>
+      <w:r>
+        <w:t xml:space="preserve">In Vivado, click the </w:t>
+      </w:r>
+      <w:r>
+        <w:rPr>
+          <w:b/>
+          <w:bCs/>
+        </w:rPr>
+        <w:t>Synthesize</w:t>
+      </w:r>
+      <w:r>
+        <w:t xml:space="preserve"> button in the left-hand pane.</w:t>
+      </w:r>
+    </w:p>
+    <w:p/>
+    <w:p/>
+    <w:p>
+      <w:pPr>
+        <w:pStyle w:val="Heading2"/>
+      </w:pPr>
+      <w:r>
+        <w:t>Install LabVIEW Patch</w:t>
+      </w:r>
+    </w:p>
+    <w:p>
+      <w:r>
+        <w:t>At the command prompt, type:</w:t>
+      </w:r>
+    </w:p>
+    <w:p>
+      <w:pPr>
+        <w:rPr>
+          <w:rFonts w:ascii="Consolas" w:hAnsi="Consolas"/>
+          <w:color w:val="7030A0"/>
+          <w:sz w:val="22"/>
+          <w:szCs w:val="22"/>
+        </w:rPr>
+      </w:pPr>
+      <w:proofErr w:type="spellStart"/>
+      <w:r>
+        <w:rPr>
+          <w:rFonts w:ascii="Consolas" w:hAnsi="Consolas"/>
+          <w:color w:val="7030A0"/>
+          <w:sz w:val="22"/>
+          <w:szCs w:val="22"/>
+        </w:rPr>
         <w:lastRenderedPageBreak/>
         <w:t>nihdl</w:t>
       </w:r>
@@ -3865,159 +4141,73 @@
           <w:sz w:val="22"/>
           <w:szCs w:val="22"/>
         </w:rPr>
-        <w:t xml:space="preserve"> extract-deps</w:t>
+        <w:t xml:space="preserve"> install-lv-patch</w:t>
       </w:r>
     </w:p>
     <w:p/>
     <w:p>
+      <w:r>
+        <w:t>This will copy a file into your LabVIEW installation and make a backup of the original file.  To revert this patch, you can run:</w:t>
+      </w:r>
+      <w:r>
+        <w:br/>
+      </w:r>
+    </w:p>
+    <w:p>
+      <w:pPr>
+        <w:rPr>
+          <w:rFonts w:ascii="Consolas" w:hAnsi="Consolas"/>
+          <w:color w:val="7030A0"/>
+          <w:sz w:val="22"/>
+          <w:szCs w:val="22"/>
+        </w:rPr>
+      </w:pPr>
+      <w:proofErr w:type="spellStart"/>
+      <w:r>
+        <w:rPr>
+          <w:rFonts w:ascii="Consolas" w:hAnsi="Consolas"/>
+          <w:color w:val="7030A0"/>
+          <w:sz w:val="22"/>
+          <w:szCs w:val="22"/>
+        </w:rPr>
+        <w:t>nihdl</w:t>
+      </w:r>
+      <w:proofErr w:type="spellEnd"/>
+      <w:r>
+        <w:rPr>
+          <w:rFonts w:ascii="Consolas" w:hAnsi="Consolas"/>
+          <w:color w:val="7030A0"/>
+          <w:sz w:val="22"/>
+          <w:szCs w:val="22"/>
+        </w:rPr>
+        <w:t xml:space="preserve"> </w:t>
+      </w:r>
+      <w:r>
+        <w:rPr>
+          <w:rFonts w:ascii="Consolas" w:hAnsi="Consolas"/>
+          <w:color w:val="7030A0"/>
+          <w:sz w:val="22"/>
+          <w:szCs w:val="22"/>
+        </w:rPr>
+        <w:t>un</w:t>
+      </w:r>
+      <w:r>
+        <w:rPr>
+          <w:rFonts w:ascii="Consolas" w:hAnsi="Consolas"/>
+          <w:color w:val="7030A0"/>
+          <w:sz w:val="22"/>
+          <w:szCs w:val="22"/>
+        </w:rPr>
+        <w:t>install-lv-patch</w:t>
+      </w:r>
+    </w:p>
+    <w:p/>
+    <w:p/>
+    <w:p>
       <w:pPr>
         <w:pStyle w:val="Heading2"/>
       </w:pPr>
-      <w:bookmarkStart w:id="5" w:name="_Toc210041311"/>
-      <w:r>
-        <w:t>Create and Synthesize the Vivado Project</w:t>
-      </w:r>
-      <w:bookmarkEnd w:id="5"/>
-    </w:p>
-    <w:p>
-      <w:r>
-        <w:t xml:space="preserve">These steps will ensure that the GitHub repo and tools are properly </w:t>
-      </w:r>
-      <w:proofErr w:type="gramStart"/>
-      <w:r>
-        <w:t>setup</w:t>
-      </w:r>
-      <w:proofErr w:type="gramEnd"/>
-      <w:r>
-        <w:t>.  Additionally, there are some files generated by the create-project command that are used in later steps.</w:t>
-      </w:r>
-    </w:p>
-    <w:p/>
-    <w:p>
-      <w:r>
-        <w:t>Run the create-project command:</w:t>
-      </w:r>
-    </w:p>
-    <w:p>
-      <w:pPr>
-        <w:rPr>
-          <w:rFonts w:ascii="Consolas" w:hAnsi="Consolas"/>
-          <w:color w:val="7030A0"/>
-          <w:sz w:val="22"/>
-          <w:szCs w:val="22"/>
-        </w:rPr>
-      </w:pPr>
-      <w:proofErr w:type="spellStart"/>
-      <w:r>
-        <w:rPr>
-          <w:rFonts w:ascii="Consolas" w:hAnsi="Consolas"/>
-          <w:color w:val="7030A0"/>
-          <w:sz w:val="22"/>
-          <w:szCs w:val="22"/>
-        </w:rPr>
-        <w:t>nihdl</w:t>
-      </w:r>
-      <w:proofErr w:type="spellEnd"/>
-      <w:r>
-        <w:rPr>
-          <w:rFonts w:ascii="Consolas" w:hAnsi="Consolas"/>
-          <w:color w:val="7030A0"/>
-          <w:sz w:val="22"/>
-          <w:szCs w:val="22"/>
-        </w:rPr>
-        <w:t xml:space="preserve"> create-project</w:t>
-      </w:r>
-    </w:p>
-    <w:p/>
-    <w:p>
-      <w:r>
-        <w:t>Run the launch-</w:t>
-      </w:r>
-      <w:proofErr w:type="spellStart"/>
-      <w:r>
-        <w:t>vivado</w:t>
-      </w:r>
-      <w:proofErr w:type="spellEnd"/>
-      <w:r>
-        <w:t xml:space="preserve"> command:</w:t>
-      </w:r>
-    </w:p>
-    <w:p>
-      <w:pPr>
-        <w:rPr>
-          <w:rFonts w:ascii="Consolas" w:hAnsi="Consolas"/>
-          <w:color w:val="7030A0"/>
-          <w:sz w:val="22"/>
-          <w:szCs w:val="22"/>
-        </w:rPr>
-      </w:pPr>
-      <w:proofErr w:type="spellStart"/>
-      <w:r>
-        <w:rPr>
-          <w:rFonts w:ascii="Consolas" w:hAnsi="Consolas"/>
-          <w:color w:val="7030A0"/>
-          <w:sz w:val="22"/>
-          <w:szCs w:val="22"/>
-        </w:rPr>
-        <w:t>nihdl</w:t>
-      </w:r>
-      <w:proofErr w:type="spellEnd"/>
-      <w:r>
-        <w:rPr>
-          <w:rFonts w:ascii="Consolas" w:hAnsi="Consolas"/>
-          <w:color w:val="7030A0"/>
-          <w:sz w:val="22"/>
-          <w:szCs w:val="22"/>
-        </w:rPr>
-        <w:t xml:space="preserve"> launch-</w:t>
-      </w:r>
-      <w:proofErr w:type="spellStart"/>
-      <w:r>
-        <w:rPr>
-          <w:rFonts w:ascii="Consolas" w:hAnsi="Consolas"/>
-          <w:color w:val="7030A0"/>
-          <w:sz w:val="22"/>
-          <w:szCs w:val="22"/>
-        </w:rPr>
-        <w:t>vivado</w:t>
-      </w:r>
-      <w:proofErr w:type="spellEnd"/>
-    </w:p>
-    <w:p>
-      <w:pPr>
-        <w:rPr>
-          <w:rFonts w:ascii="Consolas" w:hAnsi="Consolas"/>
-          <w:color w:val="0070C0"/>
-          <w:sz w:val="22"/>
-          <w:szCs w:val="22"/>
-        </w:rPr>
-      </w:pPr>
-    </w:p>
-    <w:p>
-      <w:r>
-        <w:t xml:space="preserve">In Vivado, click the </w:t>
-      </w:r>
-      <w:r>
-        <w:rPr>
-          <w:b/>
-          <w:bCs/>
-        </w:rPr>
-        <w:t>Synthesize</w:t>
-      </w:r>
-      <w:r>
-        <w:t xml:space="preserve"> button in the left-hand pane.</w:t>
-      </w:r>
-    </w:p>
-    <w:p/>
-    <w:p>
-      <w:pPr>
-        <w:pStyle w:val="Heading2"/>
-        <w:rPr>
-          <w:sz w:val="40"/>
-          <w:szCs w:val="40"/>
-        </w:rPr>
-      </w:pPr>
-      <w:bookmarkStart w:id="6" w:name="_Toc210041312"/>
+      <w:bookmarkStart w:id="6" w:name="_Toc210048119"/>
       <w:r>
         <w:t>Get the flexrio-custom repo</w:t>
       </w:r>
@@ -4028,12 +4218,10 @@
         <w:t xml:space="preserve">This exercise will start with the base PXIe-7903 in the FlexRIO repo and modify it to contain the Aurora CLIP HDL in </w:t>
       </w:r>
       <w:proofErr w:type="spellStart"/>
-      <w:proofErr w:type="gramStart"/>
       <w:r>
         <w:t>it’s</w:t>
       </w:r>
       <w:proofErr w:type="spellEnd"/>
-      <w:proofErr w:type="gramEnd"/>
       <w:r>
         <w:t xml:space="preserve"> top-level entity.</w:t>
       </w:r>
@@ -4044,7 +4232,7 @@
       </w:r>
     </w:p>
     <w:p>
-      <w:hyperlink r:id="rId10" w:history="1">
+      <w:hyperlink r:id="rId12" w:history="1">
         <w:r>
           <w:rPr>
             <w:rStyle w:val="Hyperlink"/>
@@ -4095,9 +4283,33 @@
           <w:sz w:val="22"/>
           <w:szCs w:val="22"/>
         </w:rPr>
-        <w:t>git clone https://github.com/ni/flexrio-custom</w:t>
-      </w:r>
-    </w:p>
+        <w:t xml:space="preserve">git clone </w:t>
+      </w:r>
+      <w:hyperlink r:id="rId13" w:history="1">
+        <w:r>
+          <w:rPr>
+            <w:rStyle w:val="Hyperlink"/>
+            <w:rFonts w:ascii="Consolas" w:hAnsi="Consolas"/>
+            <w:sz w:val="22"/>
+            <w:szCs w:val="22"/>
+          </w:rPr>
+          <w:t>https://github.com/ni/flexrio-custom</w:t>
+        </w:r>
+      </w:hyperlink>
+    </w:p>
+    <w:p/>
+    <w:p>
+      <w:r>
+        <w:t>Follow the same instructions as you did in the flexrio repo to install the dependencies zip file.</w:t>
+      </w:r>
+    </w:p>
+    <w:p/>
+    <w:p>
+      <w:r>
+        <w:t>Note: If you try to run the create-project command on the flexrio-custom repo at this time, it will fail.  This is because the repo requires a LabVIEW FPGA netlist to be generated.  You will learn how to do this in the next section.</w:t>
+      </w:r>
+    </w:p>
+    <w:p/>
     <w:p/>
     <w:p>
       <w:pPr>
@@ -4116,7 +4328,7 @@
       <w:pPr>
         <w:pStyle w:val="Heading1"/>
       </w:pPr>
-      <w:bookmarkStart w:id="7" w:name="_Toc210041313"/>
+      <w:bookmarkStart w:id="7" w:name="_Toc210048120"/>
       <w:r>
         <w:lastRenderedPageBreak/>
         <w:t>CLIP Migration</w:t>
@@ -4258,7 +4470,7 @@
                     <pic:cNvPicPr/>
                   </pic:nvPicPr>
                   <pic:blipFill>
-                    <a:blip r:embed="rId11"/>
+                    <a:blip r:embed="rId14"/>
                     <a:stretch>
                       <a:fillRect/>
                     </a:stretch>
@@ -4343,7 +4555,7 @@
                     <pic:cNvPicPr/>
                   </pic:nvPicPr>
                   <pic:blipFill>
-                    <a:blip r:embed="rId12"/>
+                    <a:blip r:embed="rId15"/>
                     <a:stretch>
                       <a:fillRect/>
                     </a:stretch>
@@ -4388,15 +4600,7 @@
       </w:r>
       <w:proofErr w:type="spellEnd"/>
       <w:r>
-        <w:t xml:space="preserve"> will show </w:t>
-      </w:r>
-      <w:proofErr w:type="gramStart"/>
-      <w:r>
-        <w:t>up on</w:t>
-      </w:r>
-      <w:proofErr w:type="gramEnd"/>
-      <w:r>
-        <w:t xml:space="preserve"> as IO on the custom LabVIEW FPGA target in the LabVIEW project.</w:t>
+        <w:t xml:space="preserve"> will show up on as IO on the custom LabVIEW FPGA target in the LabVIEW project.</w:t>
       </w:r>
       <w:r>
         <w:t xml:space="preserve">  This board IO will become new interfaces on the ports of the LabVIEW Window</w:t>
@@ -4413,22 +4617,14 @@
     </w:p>
     <w:p>
       <w:r>
-        <w:t xml:space="preserve">The Fabric and Socket interfaces of the CLIP will be directly in the top-level HDL </w:t>
-      </w:r>
-      <w:proofErr w:type="gramStart"/>
-      <w:r>
-        <w:t>file</w:t>
-      </w:r>
-      <w:proofErr w:type="gramEnd"/>
-      <w:r>
-        <w:t xml:space="preserve"> and you will connect those up the same way they were previously connected to the LabVIEW Window.</w:t>
+        <w:t>The Fabric and Socket interfaces of the CLIP will be directly in the top-level HDL file and you will connect those up the same way they were previously connected to the LabVIEW Window.</w:t>
       </w:r>
     </w:p>
     <w:p>
       <w:pPr>
         <w:pStyle w:val="Heading1"/>
       </w:pPr>
-      <w:bookmarkStart w:id="8" w:name="_Toc210041314"/>
+      <w:bookmarkStart w:id="8" w:name="_Toc210048121"/>
       <w:r>
         <w:lastRenderedPageBreak/>
         <w:t>Customize the PXIe-7903 with Aurora</w:t>
@@ -4440,7 +4636,7 @@
       <w:pPr>
         <w:pStyle w:val="Heading2"/>
       </w:pPr>
-      <w:bookmarkStart w:id="9" w:name="_Toc210041315"/>
+      <w:bookmarkStart w:id="9" w:name="_Toc210048122"/>
       <w:r>
         <w:t>Configure Project Settings INI for CLIP Migration</w:t>
       </w:r>
@@ -4848,15 +5044,7 @@
         <w:t xml:space="preserve"> setting</w:t>
       </w:r>
       <w:r>
-        <w:t xml:space="preserve">.  The CLIP’s top-level entity will be placed directly in the top-level HDL file of the FPGA target.  </w:t>
-      </w:r>
-      <w:proofErr w:type="gramStart"/>
-      <w:r>
-        <w:t>So</w:t>
-      </w:r>
-      <w:proofErr w:type="gramEnd"/>
-      <w:r>
-        <w:t xml:space="preserve"> the path is just the name of the CLIP’s top-level entity.</w:t>
+        <w:t>.  The CLIP’s top-level entity will be placed directly in the top-level HDL file of the FPGA target.  So the path is just the name of the CLIP’s top-level entity.</w:t>
       </w:r>
     </w:p>
     <w:p>
@@ -5170,15 +5358,7 @@
     <w:p/>
     <w:p>
       <w:r>
-        <w:t xml:space="preserve">The VHD and XDC files generated by the </w:t>
-      </w:r>
-      <w:proofErr w:type="gramStart"/>
-      <w:r>
-        <w:t>migrate</w:t>
-      </w:r>
-      <w:proofErr w:type="gramEnd"/>
-      <w:r>
-        <w:t xml:space="preserve"> CLIP command go into the objects folder.  The contents of these files will be manually copied into source code in later steps.</w:t>
+        <w:t>The VHD and XDC files generated by the migrate CLIP command go into the objects folder.  The contents of these files will be manually copied into source code in later steps.</w:t>
       </w:r>
     </w:p>
     <w:p>
@@ -5197,15 +5377,7 @@
         <w:t xml:space="preserve">directly </w:t>
       </w:r>
       <w:r>
-        <w:t>treated as source code (that can get checked in to GitHub</w:t>
-      </w:r>
-      <w:proofErr w:type="gramStart"/>
-      <w:r>
-        <w:t>)</w:t>
-      </w:r>
-      <w:proofErr w:type="gramEnd"/>
-      <w:r>
-        <w:t xml:space="preserve"> so we put it in the </w:t>
+        <w:t xml:space="preserve">treated as source code (that can get checked in to GitHub) so we put it in the </w:t>
       </w:r>
       <w:proofErr w:type="spellStart"/>
       <w:r>
@@ -5245,15 +5417,7 @@
       </w:r>
       <w:proofErr w:type="spellEnd"/>
       <w:r>
-        <w:t xml:space="preserve"> </w:t>
-      </w:r>
-      <w:proofErr w:type="gramStart"/>
-      <w:r>
-        <w:t>file generated</w:t>
-      </w:r>
-      <w:proofErr w:type="gramEnd"/>
-      <w:r>
-        <w:t xml:space="preserve"> by the CLIP migration tool</w:t>
+        <w:t xml:space="preserve"> file generated by the CLIP migration tool</w:t>
       </w:r>
       <w:r>
         <w:t>:</w:t>
@@ -5423,30 +5587,14 @@
         <w:t xml:space="preserve"> </w:t>
       </w:r>
       <w:r>
-        <w:t xml:space="preserve">have no bearing on the execution of the </w:t>
-      </w:r>
-      <w:proofErr w:type="gramStart"/>
-      <w:r>
-        <w:t>migrate</w:t>
-      </w:r>
-      <w:proofErr w:type="gramEnd"/>
-      <w:r>
-        <w:t xml:space="preserve"> CLIP command.  But we’ll set them here because they will consume the output of the </w:t>
-      </w:r>
-      <w:proofErr w:type="gramStart"/>
-      <w:r>
-        <w:t>migrate</w:t>
-      </w:r>
-      <w:proofErr w:type="gramEnd"/>
-      <w:r>
-        <w:t xml:space="preserve"> CLIP command.</w:t>
+        <w:t>have no bearing on the execution of the migrate CLIP command.  But we’ll set them here because they will consume the output of the migrate CLIP command.</w:t>
       </w:r>
     </w:p>
     <w:p>
       <w:pPr>
         <w:pStyle w:val="Heading2"/>
       </w:pPr>
-      <w:bookmarkStart w:id="10" w:name="_Toc210041316"/>
+      <w:bookmarkStart w:id="10" w:name="_Toc210048123"/>
       <w:r>
         <w:lastRenderedPageBreak/>
         <w:t>Run CLIP Migration</w:t>
@@ -5567,7 +5715,7 @@
       <w:pPr>
         <w:pStyle w:val="Heading2"/>
       </w:pPr>
-      <w:bookmarkStart w:id="11" w:name="_Toc210041317"/>
+      <w:bookmarkStart w:id="11" w:name="_Toc210048124"/>
       <w:r>
         <w:t>Modify Board IO CSV</w:t>
       </w:r>
@@ -5580,23 +5728,7 @@
     </w:p>
     <w:p>
       <w:r>
-        <w:t xml:space="preserve">This file was generated from the CLIP’s XML definition file.  There are </w:t>
-      </w:r>
-      <w:proofErr w:type="gramStart"/>
-      <w:r>
-        <w:t>a number of</w:t>
-      </w:r>
-      <w:proofErr w:type="gramEnd"/>
-      <w:r>
-        <w:t xml:space="preserve"> changes we </w:t>
-      </w:r>
-      <w:proofErr w:type="gramStart"/>
-      <w:r>
-        <w:t>have to</w:t>
-      </w:r>
-      <w:proofErr w:type="gramEnd"/>
-      <w:r>
-        <w:t xml:space="preserve"> make so that </w:t>
+        <w:t xml:space="preserve">This file was generated from the CLIP’s XML definition file.  There are a number of changes we have to make so that </w:t>
       </w:r>
       <w:r>
         <w:t>the signals can be used as board IO.</w:t>
@@ -5610,15 +5742,7 @@
       </w:r>
       <w:proofErr w:type="spellEnd"/>
       <w:r>
-        <w:t xml:space="preserve"> – No changes are needed for this column.  However, </w:t>
-      </w:r>
-      <w:proofErr w:type="gramStart"/>
-      <w:r>
-        <w:t>at this time</w:t>
-      </w:r>
-      <w:proofErr w:type="gramEnd"/>
-      <w:r>
-        <w:t xml:space="preserve"> the </w:t>
+        <w:t xml:space="preserve"> – No changes are needed for this column.  However, at this time the </w:t>
       </w:r>
       <w:r>
         <w:t>back</w:t>
@@ -5673,15 +5797,7 @@
         <w:t xml:space="preserve">  </w:t>
       </w:r>
       <w:r>
-        <w:t xml:space="preserve">When you instantiate the CLIP HDL </w:t>
-      </w:r>
-      <w:proofErr w:type="gramStart"/>
-      <w:r>
-        <w:t>in</w:t>
-      </w:r>
-      <w:proofErr w:type="gramEnd"/>
-      <w:r>
-        <w:t xml:space="preserve"> the top-level of the PXIe-7903, you will manually hook these signals to the 80 MHz clock.</w:t>
+        <w:t>When you instantiate the CLIP HDL in the top-level of the PXIe-7903, you will manually hook these signals to the 80 MHz clock.</w:t>
       </w:r>
     </w:p>
     <w:p>
@@ -5703,21 +5819,8 @@
       <w:r>
         <w:t xml:space="preserve">.  </w:t>
       </w:r>
-      <w:proofErr w:type="gramStart"/>
-      <w:r>
-        <w:t>So</w:t>
-      </w:r>
-      <w:proofErr w:type="gramEnd"/>
-      <w:r>
-        <w:t xml:space="preserve"> in the CSV file, signals that required </w:t>
-      </w:r>
-      <w:proofErr w:type="gramStart"/>
-      <w:r>
-        <w:t>these clock</w:t>
-      </w:r>
-      <w:proofErr w:type="gramEnd"/>
-      <w:r>
-        <w:t xml:space="preserve"> domains should be configured to be required to be in the “80 MHz Clock” domain.</w:t>
+      <w:r>
+        <w:t>So in the CSV file, signals that required these clock domains should be configured to be required to be in the “80 MHz Clock” domain.</w:t>
       </w:r>
     </w:p>
     <w:p>
@@ -5742,7 +5845,7 @@
                     <pic:cNvPicPr/>
                   </pic:nvPicPr>
                   <pic:blipFill>
-                    <a:blip r:embed="rId13"/>
+                    <a:blip r:embed="rId16"/>
                     <a:stretch>
                       <a:fillRect/>
                     </a:stretch>
@@ -5956,15 +6059,7 @@
     </w:p>
     <w:p>
       <w:r>
-        <w:t xml:space="preserve">The CLIP XML also defines </w:t>
-      </w:r>
-      <w:proofErr w:type="gramStart"/>
-      <w:r>
-        <w:t>a number of</w:t>
-      </w:r>
-      <w:proofErr w:type="gramEnd"/>
-      <w:r>
-        <w:t xml:space="preserve"> port-specific clocks that </w:t>
+        <w:t xml:space="preserve">The CLIP XML also defines a number of port-specific clocks that </w:t>
       </w:r>
       <w:r>
         <w:t>show up as clocks in the LabVIEW FPGA project</w:t>
@@ -5995,7 +6090,7 @@
                     <pic:cNvPicPr/>
                   </pic:nvPicPr>
                   <pic:blipFill>
-                    <a:blip r:embed="rId14"/>
+                    <a:blip r:embed="rId17"/>
                     <a:stretch>
                       <a:fillRect/>
                     </a:stretch>
@@ -6257,7 +6352,7 @@
       <w:pPr>
         <w:pStyle w:val="Heading2"/>
       </w:pPr>
-      <w:bookmarkStart w:id="12" w:name="_Toc210041318"/>
+      <w:bookmarkStart w:id="12" w:name="_Toc210048125"/>
       <w:r>
         <w:lastRenderedPageBreak/>
         <w:t>Instantiate</w:t>
@@ -6293,15 +6388,7 @@
     </w:p>
     <w:p>
       <w:r>
-        <w:t xml:space="preserve">There are </w:t>
-      </w:r>
-      <w:proofErr w:type="gramStart"/>
-      <w:r>
-        <w:t>a number of</w:t>
-      </w:r>
-      <w:proofErr w:type="gramEnd"/>
-      <w:r>
-        <w:t xml:space="preserve"> changes to make so that the Aurora CLIP HDL can be instantiated within it.  It may also be helpful to diff your</w:t>
+        <w:t>There are a number of changes to make so that the Aurora CLIP HDL can be instantiated within it.  It may also be helpful to diff your</w:t>
       </w:r>
       <w:r>
         <w:t xml:space="preserve"> work against the already-customized PXIe-7903 found her</w:t>
@@ -6365,7 +6452,7 @@
       <w:pPr>
         <w:pStyle w:val="Heading3"/>
       </w:pPr>
-      <w:bookmarkStart w:id="13" w:name="_Toc210041319"/>
+      <w:bookmarkStart w:id="13" w:name="_Toc210048126"/>
       <w:r>
         <w:t>Uncomment MGT Port Lines</w:t>
       </w:r>
@@ -6379,15 +6466,7 @@
         <w:t>lines</w:t>
       </w:r>
       <w:r>
-        <w:t xml:space="preserve"> (or </w:t>
-      </w:r>
-      <w:proofErr w:type="gramStart"/>
-      <w:r>
-        <w:t>none at all</w:t>
-      </w:r>
-      <w:proofErr w:type="gramEnd"/>
-      <w:r>
-        <w:t xml:space="preserve">).  To accommodate this, the LabVIEW FPGA </w:t>
+        <w:t xml:space="preserve"> (or none at all).  To accommodate this, the LabVIEW FPGA </w:t>
       </w:r>
       <w:r>
         <w:t>code</w:t>
@@ -6404,15 +6483,7 @@
       </w:r>
       <w:proofErr w:type="spellEnd"/>
       <w:r>
-        <w:t xml:space="preserve">, you will see the MGT port lines </w:t>
-      </w:r>
-      <w:proofErr w:type="gramStart"/>
-      <w:r>
-        <w:t>in-between</w:t>
-      </w:r>
-      <w:proofErr w:type="gramEnd"/>
-      <w:r>
-        <w:t xml:space="preserve"> these tokens: </w:t>
+        <w:t xml:space="preserve">, you will see the MGT port lines in-between these tokens: </w:t>
       </w:r>
       <w:r>
         <w:t> </w:t>
@@ -6428,85 +6499,44 @@
           <w:szCs w:val="22"/>
         </w:rPr>
       </w:pPr>
-      <w:proofErr w:type="gramStart"/>
-      <w:r>
-        <w:rPr>
-          <w:rFonts w:ascii="Consolas" w:hAnsi="Consolas"/>
-          <w:color w:val="0070C0"/>
-          <w:sz w:val="22"/>
-          <w:szCs w:val="22"/>
-        </w:rPr>
-        <w:t>--@@</w:t>
-      </w:r>
-      <w:proofErr w:type="gramEnd"/>
-      <w:r>
-        <w:rPr>
-          <w:rFonts w:ascii="Consolas" w:hAnsi="Consolas"/>
-          <w:color w:val="0070C0"/>
-          <w:sz w:val="22"/>
-          <w:szCs w:val="22"/>
-        </w:rPr>
-        <w:t>BEGIN TOP_LEVEL_PORT</w:t>
-      </w:r>
-    </w:p>
-    <w:p>
-      <w:pPr>
-        <w:spacing w:after="0" w:line="276" w:lineRule="auto"/>
-        <w:rPr>
-          <w:rFonts w:ascii="Consolas" w:hAnsi="Consolas"/>
-          <w:color w:val="0070C0"/>
-          <w:sz w:val="22"/>
-          <w:szCs w:val="22"/>
-        </w:rPr>
-      </w:pPr>
-      <w:r>
-        <w:rPr>
-          <w:rFonts w:ascii="Consolas" w:hAnsi="Consolas"/>
-          <w:color w:val="0070C0"/>
-          <w:sz w:val="22"/>
-          <w:szCs w:val="22"/>
-        </w:rPr>
-        <w:t xml:space="preserve">--    MgtPortRxLane0_p   </w:t>
-      </w:r>
-      <w:proofErr w:type="gramStart"/>
-      <w:r>
-        <w:rPr>
-          <w:rFonts w:ascii="Consolas" w:hAnsi="Consolas"/>
-          <w:color w:val="0070C0"/>
-          <w:sz w:val="22"/>
-          <w:szCs w:val="22"/>
-        </w:rPr>
-        <w:t>  :</w:t>
-      </w:r>
-      <w:proofErr w:type="gramEnd"/>
-      <w:r>
-        <w:rPr>
-          <w:rFonts w:ascii="Consolas" w:hAnsi="Consolas"/>
-          <w:color w:val="0070C0"/>
-          <w:sz w:val="22"/>
-          <w:szCs w:val="22"/>
-        </w:rPr>
-        <w:t xml:space="preserve"> in    </w:t>
-      </w:r>
-      <w:proofErr w:type="spellStart"/>
-      <w:r>
-        <w:rPr>
-          <w:rFonts w:ascii="Consolas" w:hAnsi="Consolas"/>
-          <w:color w:val="0070C0"/>
-          <w:sz w:val="22"/>
-          <w:szCs w:val="22"/>
-        </w:rPr>
-        <w:t>std_</w:t>
-      </w:r>
-      <w:proofErr w:type="gramStart"/>
-      <w:r>
-        <w:rPr>
-          <w:rFonts w:ascii="Consolas" w:hAnsi="Consolas"/>
-          <w:color w:val="0070C0"/>
-          <w:sz w:val="22"/>
-          <w:szCs w:val="22"/>
-        </w:rPr>
-        <w:t>logic</w:t>
+      <w:r>
+        <w:rPr>
+          <w:rFonts w:ascii="Consolas" w:hAnsi="Consolas"/>
+          <w:color w:val="0070C0"/>
+          <w:sz w:val="22"/>
+          <w:szCs w:val="22"/>
+        </w:rPr>
+        <w:t>--@@BEGIN TOP_LEVEL_PORT</w:t>
+      </w:r>
+    </w:p>
+    <w:p>
+      <w:pPr>
+        <w:spacing w:after="0" w:line="276" w:lineRule="auto"/>
+        <w:rPr>
+          <w:rFonts w:ascii="Consolas" w:hAnsi="Consolas"/>
+          <w:color w:val="0070C0"/>
+          <w:sz w:val="22"/>
+          <w:szCs w:val="22"/>
+        </w:rPr>
+      </w:pPr>
+      <w:r>
+        <w:rPr>
+          <w:rFonts w:ascii="Consolas" w:hAnsi="Consolas"/>
+          <w:color w:val="0070C0"/>
+          <w:sz w:val="22"/>
+          <w:szCs w:val="22"/>
+        </w:rPr>
+        <w:t>--    MgtPortRxLane0_p     : in    </w:t>
+      </w:r>
+      <w:proofErr w:type="spellStart"/>
+      <w:r>
+        <w:rPr>
+          <w:rFonts w:ascii="Consolas" w:hAnsi="Consolas"/>
+          <w:color w:val="0070C0"/>
+          <w:sz w:val="22"/>
+          <w:szCs w:val="22"/>
+        </w:rPr>
+        <w:t>std_logic</w:t>
       </w:r>
       <w:proofErr w:type="spellEnd"/>
       <w:r>
@@ -6518,66 +6548,35 @@
         </w:rPr>
         <w:t>;</w:t>
       </w:r>
-      <w:proofErr w:type="gramEnd"/>
-    </w:p>
-    <w:p>
-      <w:pPr>
-        <w:spacing w:after="0" w:line="276" w:lineRule="auto"/>
-        <w:rPr>
-          <w:rFonts w:ascii="Consolas" w:hAnsi="Consolas"/>
-          <w:color w:val="0070C0"/>
-          <w:sz w:val="22"/>
-          <w:szCs w:val="22"/>
-        </w:rPr>
-      </w:pPr>
-      <w:r>
-        <w:rPr>
-          <w:rFonts w:ascii="Consolas" w:hAnsi="Consolas"/>
-          <w:color w:val="0070C0"/>
-          <w:sz w:val="22"/>
-          <w:szCs w:val="22"/>
-        </w:rPr>
-        <w:t xml:space="preserve">--    MgtPortRxLane1_p   </w:t>
-      </w:r>
-      <w:proofErr w:type="gramStart"/>
-      <w:r>
-        <w:rPr>
-          <w:rFonts w:ascii="Consolas" w:hAnsi="Consolas"/>
-          <w:color w:val="0070C0"/>
-          <w:sz w:val="22"/>
-          <w:szCs w:val="22"/>
-        </w:rPr>
-        <w:t>  :</w:t>
-      </w:r>
-      <w:proofErr w:type="gramEnd"/>
-      <w:r>
-        <w:rPr>
-          <w:rFonts w:ascii="Consolas" w:hAnsi="Consolas"/>
-          <w:color w:val="0070C0"/>
-          <w:sz w:val="22"/>
-          <w:szCs w:val="22"/>
-        </w:rPr>
-        <w:t xml:space="preserve"> in    </w:t>
-      </w:r>
-      <w:proofErr w:type="spellStart"/>
-      <w:r>
-        <w:rPr>
-          <w:rFonts w:ascii="Consolas" w:hAnsi="Consolas"/>
-          <w:color w:val="0070C0"/>
-          <w:sz w:val="22"/>
-          <w:szCs w:val="22"/>
-        </w:rPr>
-        <w:t>std_</w:t>
-      </w:r>
-      <w:proofErr w:type="gramStart"/>
-      <w:r>
-        <w:rPr>
-          <w:rFonts w:ascii="Consolas" w:hAnsi="Consolas"/>
-          <w:color w:val="0070C0"/>
-          <w:sz w:val="22"/>
-          <w:szCs w:val="22"/>
-        </w:rPr>
-        <w:t>logic</w:t>
+    </w:p>
+    <w:p>
+      <w:pPr>
+        <w:spacing w:after="0" w:line="276" w:lineRule="auto"/>
+        <w:rPr>
+          <w:rFonts w:ascii="Consolas" w:hAnsi="Consolas"/>
+          <w:color w:val="0070C0"/>
+          <w:sz w:val="22"/>
+          <w:szCs w:val="22"/>
+        </w:rPr>
+      </w:pPr>
+      <w:r>
+        <w:rPr>
+          <w:rFonts w:ascii="Consolas" w:hAnsi="Consolas"/>
+          <w:color w:val="0070C0"/>
+          <w:sz w:val="22"/>
+          <w:szCs w:val="22"/>
+        </w:rPr>
+        <w:t>--    MgtPortRxLane1_p     : in    </w:t>
+      </w:r>
+      <w:proofErr w:type="spellStart"/>
+      <w:r>
+        <w:rPr>
+          <w:rFonts w:ascii="Consolas" w:hAnsi="Consolas"/>
+          <w:color w:val="0070C0"/>
+          <w:sz w:val="22"/>
+          <w:szCs w:val="22"/>
+        </w:rPr>
+        <w:t>std_logic</w:t>
       </w:r>
       <w:proofErr w:type="spellEnd"/>
       <w:r>
@@ -6589,66 +6588,35 @@
         </w:rPr>
         <w:t>;</w:t>
       </w:r>
-      <w:proofErr w:type="gramEnd"/>
-    </w:p>
-    <w:p>
-      <w:pPr>
-        <w:spacing w:after="0" w:line="276" w:lineRule="auto"/>
-        <w:rPr>
-          <w:rFonts w:ascii="Consolas" w:hAnsi="Consolas"/>
-          <w:color w:val="0070C0"/>
-          <w:sz w:val="22"/>
-          <w:szCs w:val="22"/>
-        </w:rPr>
-      </w:pPr>
-      <w:r>
-        <w:rPr>
-          <w:rFonts w:ascii="Consolas" w:hAnsi="Consolas"/>
-          <w:color w:val="0070C0"/>
-          <w:sz w:val="22"/>
-          <w:szCs w:val="22"/>
-        </w:rPr>
-        <w:t xml:space="preserve">--    MgtPortRxLane2_p   </w:t>
-      </w:r>
-      <w:proofErr w:type="gramStart"/>
-      <w:r>
-        <w:rPr>
-          <w:rFonts w:ascii="Consolas" w:hAnsi="Consolas"/>
-          <w:color w:val="0070C0"/>
-          <w:sz w:val="22"/>
-          <w:szCs w:val="22"/>
-        </w:rPr>
-        <w:t>  :</w:t>
-      </w:r>
-      <w:proofErr w:type="gramEnd"/>
-      <w:r>
-        <w:rPr>
-          <w:rFonts w:ascii="Consolas" w:hAnsi="Consolas"/>
-          <w:color w:val="0070C0"/>
-          <w:sz w:val="22"/>
-          <w:szCs w:val="22"/>
-        </w:rPr>
-        <w:t xml:space="preserve"> in    </w:t>
-      </w:r>
-      <w:proofErr w:type="spellStart"/>
-      <w:r>
-        <w:rPr>
-          <w:rFonts w:ascii="Consolas" w:hAnsi="Consolas"/>
-          <w:color w:val="0070C0"/>
-          <w:sz w:val="22"/>
-          <w:szCs w:val="22"/>
-        </w:rPr>
-        <w:t>std_</w:t>
-      </w:r>
-      <w:proofErr w:type="gramStart"/>
-      <w:r>
-        <w:rPr>
-          <w:rFonts w:ascii="Consolas" w:hAnsi="Consolas"/>
-          <w:color w:val="0070C0"/>
-          <w:sz w:val="22"/>
-          <w:szCs w:val="22"/>
-        </w:rPr>
-        <w:t>logic</w:t>
+    </w:p>
+    <w:p>
+      <w:pPr>
+        <w:spacing w:after="0" w:line="276" w:lineRule="auto"/>
+        <w:rPr>
+          <w:rFonts w:ascii="Consolas" w:hAnsi="Consolas"/>
+          <w:color w:val="0070C0"/>
+          <w:sz w:val="22"/>
+          <w:szCs w:val="22"/>
+        </w:rPr>
+      </w:pPr>
+      <w:r>
+        <w:rPr>
+          <w:rFonts w:ascii="Consolas" w:hAnsi="Consolas"/>
+          <w:color w:val="0070C0"/>
+          <w:sz w:val="22"/>
+          <w:szCs w:val="22"/>
+        </w:rPr>
+        <w:t>--    MgtPortRxLane2_p     : in    </w:t>
+      </w:r>
+      <w:proofErr w:type="spellStart"/>
+      <w:r>
+        <w:rPr>
+          <w:rFonts w:ascii="Consolas" w:hAnsi="Consolas"/>
+          <w:color w:val="0070C0"/>
+          <w:sz w:val="22"/>
+          <w:szCs w:val="22"/>
+        </w:rPr>
+        <w:t>std_logic</w:t>
       </w:r>
       <w:proofErr w:type="spellEnd"/>
       <w:r>
@@ -6660,7 +6628,6 @@
         </w:rPr>
         <w:t>;</w:t>
       </w:r>
-      <w:proofErr w:type="gramEnd"/>
     </w:p>
     <w:p>
       <w:pPr>
@@ -6692,25 +6659,14 @@
           <w:szCs w:val="22"/>
         </w:rPr>
       </w:pPr>
-      <w:proofErr w:type="gramStart"/>
-      <w:r>
-        <w:rPr>
-          <w:rFonts w:ascii="Consolas" w:hAnsi="Consolas"/>
-          <w:color w:val="0070C0"/>
-          <w:sz w:val="22"/>
-          <w:szCs w:val="22"/>
-        </w:rPr>
-        <w:t>--@@</w:t>
-      </w:r>
-      <w:proofErr w:type="gramEnd"/>
-      <w:r>
-        <w:rPr>
-          <w:rFonts w:ascii="Consolas" w:hAnsi="Consolas"/>
-          <w:color w:val="0070C0"/>
-          <w:sz w:val="22"/>
-          <w:szCs w:val="22"/>
-        </w:rPr>
-        <w:t>END TOP_LEVEL_PORT</w:t>
+      <w:r>
+        <w:rPr>
+          <w:rFonts w:ascii="Consolas" w:hAnsi="Consolas"/>
+          <w:color w:val="0070C0"/>
+          <w:sz w:val="22"/>
+          <w:szCs w:val="22"/>
+        </w:rPr>
+        <w:t>--@@END TOP_LEVEL_PORT</w:t>
       </w:r>
     </w:p>
     <w:p/>
@@ -6719,26 +6675,10 @@
         <w:t>Since we are manually instantiating the Aurora MGT’s in the file</w:t>
       </w:r>
       <w:r>
-        <w:t xml:space="preserve">, and our design uses </w:t>
-      </w:r>
-      <w:proofErr w:type="gramStart"/>
-      <w:r>
-        <w:t>all of</w:t>
-      </w:r>
-      <w:proofErr w:type="gramEnd"/>
-      <w:r>
-        <w:t xml:space="preserve"> the lines</w:t>
-      </w:r>
-      <w:r>
-        <w:t xml:space="preserve">, we can uncomment </w:t>
-      </w:r>
-      <w:proofErr w:type="gramStart"/>
-      <w:r>
-        <w:t>all of</w:t>
-      </w:r>
-      <w:proofErr w:type="gramEnd"/>
-      <w:r>
-        <w:t xml:space="preserve"> the port lines</w:t>
+        <w:t>, and our design uses all of the lines</w:t>
+      </w:r>
+      <w:r>
+        <w:t>, we can uncomment all of the port lines</w:t>
       </w:r>
       <w:r>
         <w:t>.</w:t>
@@ -6762,7 +6702,7 @@
       <w:pPr>
         <w:pStyle w:val="Heading3"/>
       </w:pPr>
-      <w:bookmarkStart w:id="14" w:name="_Toc210041320"/>
+      <w:bookmarkStart w:id="14" w:name="_Toc210048127"/>
       <w:r>
         <w:lastRenderedPageBreak/>
         <w:t>Generate TheWindow.vhd Stub</w:t>
@@ -6782,15 +6722,7 @@
         <w:t xml:space="preserve"> IO to the LabVIEW FPGA window.</w:t>
       </w:r>
       <w:r>
-        <w:t xml:space="preserve">  </w:t>
-      </w:r>
-      <w:proofErr w:type="gramStart"/>
-      <w:r>
-        <w:t>So</w:t>
-      </w:r>
-      <w:proofErr w:type="gramEnd"/>
-      <w:r>
-        <w:t xml:space="preserve"> we must insert these ports into both the component definition and component instantiation of </w:t>
+        <w:t xml:space="preserve">  So we must insert these ports into both the component definition and component instantiation of </w:t>
       </w:r>
       <w:proofErr w:type="spellStart"/>
       <w:r>
@@ -6867,15 +6799,7 @@
     </w:p>
     <w:p>
       <w:r>
-        <w:t xml:space="preserve">But since running the migrate-clip command, we now have </w:t>
-      </w:r>
-      <w:proofErr w:type="gramStart"/>
-      <w:r>
-        <w:t>all of</w:t>
-      </w:r>
-      <w:proofErr w:type="gramEnd"/>
-      <w:r>
-        <w:t xml:space="preserve"> the CLIP signals in the </w:t>
+        <w:t xml:space="preserve">But since running the migrate-clip command, we now have all of the CLIP signals in the </w:t>
       </w:r>
       <w:proofErr w:type="spellStart"/>
       <w:r>
@@ -6883,23 +6807,7 @@
       </w:r>
       <w:proofErr w:type="spellEnd"/>
       <w:r>
-        <w:t xml:space="preserve"> CSV file.  </w:t>
-      </w:r>
-      <w:proofErr w:type="gramStart"/>
-      <w:r>
-        <w:t>So</w:t>
-      </w:r>
-      <w:proofErr w:type="gramEnd"/>
-      <w:r>
-        <w:t xml:space="preserve"> if we re-run the create-project command, </w:t>
-      </w:r>
-      <w:proofErr w:type="gramStart"/>
-      <w:r>
-        <w:t>all of</w:t>
-      </w:r>
-      <w:proofErr w:type="gramEnd"/>
-      <w:r>
-        <w:t xml:space="preserve"> that IO will be pulled into TheWindow.vhd port stub.</w:t>
+        <w:t xml:space="preserve"> CSV file.  So if we re-run the create-project command, all of that IO will be pulled into TheWindow.vhd port stub.</w:t>
       </w:r>
     </w:p>
     <w:p>
@@ -6968,13 +6876,8 @@
       </w:r>
     </w:p>
     <w:p>
-      <w:proofErr w:type="gramStart"/>
-      <w:r>
-        <w:t>Next</w:t>
-      </w:r>
-      <w:proofErr w:type="gramEnd"/>
-      <w:r>
-        <w:t xml:space="preserve"> we will</w:t>
+      <w:r>
+        <w:t>Next we will</w:t>
       </w:r>
       <w:r>
         <w:t xml:space="preserve"> update TheWindow.vhd instantiation in the top-level HDL file (</w:t>
@@ -7001,7 +6904,7 @@
       <w:pPr>
         <w:pStyle w:val="Heading3"/>
       </w:pPr>
-      <w:bookmarkStart w:id="15" w:name="_Toc210041321"/>
+      <w:bookmarkStart w:id="15" w:name="_Toc210048128"/>
       <w:r>
         <w:t xml:space="preserve">Add Custom Board IO to </w:t>
       </w:r>
@@ -7118,19 +7021,8 @@
           <w:sz w:val="22"/>
           <w:szCs w:val="22"/>
         </w:rPr>
-        <w:t xml:space="preserve">    </w:t>
-      </w:r>
-      <w:proofErr w:type="gramStart"/>
-      <w:r>
-        <w:rPr>
-          <w:rFonts w:ascii="Consolas" w:hAnsi="Consolas"/>
-          <w:color w:val="0070C0"/>
-          <w:sz w:val="22"/>
-          <w:szCs w:val="22"/>
-        </w:rPr>
-        <w:t>port(</w:t>
-      </w:r>
-      <w:proofErr w:type="gramEnd"/>
+        <w:t>    port(</w:t>
+      </w:r>
     </w:p>
     <w:p>
       <w:pPr>
@@ -7358,7 +7250,7 @@
       <w:pPr>
         <w:pStyle w:val="Heading3"/>
       </w:pPr>
-      <w:bookmarkStart w:id="16" w:name="_Toc210041322"/>
+      <w:bookmarkStart w:id="16" w:name="_Toc210048129"/>
       <w:r>
         <w:t>Add Custom Board IO Signal Definitions</w:t>
       </w:r>
@@ -7439,15 +7331,7 @@
     <w:p/>
     <w:p>
       <w:r>
-        <w:t xml:space="preserve">Copy </w:t>
-      </w:r>
-      <w:proofErr w:type="gramStart"/>
-      <w:r>
-        <w:t>all of</w:t>
-      </w:r>
-      <w:proofErr w:type="gramEnd"/>
-      <w:r>
-        <w:t xml:space="preserve"> the signal definitions </w:t>
+        <w:t xml:space="preserve">Copy all of the signal definitions </w:t>
       </w:r>
       <w:r>
         <w:t>into</w:t>
@@ -7519,27 +7403,7 @@
           <w:sz w:val="22"/>
           <w:szCs w:val="22"/>
         </w:rPr>
-        <w:t>  signal TopLevelClk</w:t>
-      </w:r>
-      <w:proofErr w:type="gramStart"/>
-      <w:r>
-        <w:rPr>
-          <w:rFonts w:ascii="Consolas" w:hAnsi="Consolas"/>
-          <w:color w:val="0070C0"/>
-          <w:sz w:val="22"/>
-          <w:szCs w:val="22"/>
-        </w:rPr>
-        <w:t>80 :</w:t>
-      </w:r>
-      <w:proofErr w:type="gramEnd"/>
-      <w:r>
-        <w:rPr>
-          <w:rFonts w:ascii="Consolas" w:hAnsi="Consolas"/>
-          <w:color w:val="0070C0"/>
-          <w:sz w:val="22"/>
-          <w:szCs w:val="22"/>
-        </w:rPr>
-        <w:t xml:space="preserve"> </w:t>
+        <w:t xml:space="preserve">  signal TopLevelClk80 : </w:t>
       </w:r>
       <w:proofErr w:type="spellStart"/>
       <w:r>
@@ -7559,27 +7423,7 @@
           <w:sz w:val="22"/>
           <w:szCs w:val="22"/>
         </w:rPr>
-        <w:t xml:space="preserve">; -- Top Level Clock </w:t>
-      </w:r>
-      <w:proofErr w:type="gramStart"/>
-      <w:r>
-        <w:rPr>
-          <w:rFonts w:ascii="Consolas" w:hAnsi="Consolas"/>
-          <w:color w:val="0070C0"/>
-          <w:sz w:val="22"/>
-          <w:szCs w:val="22"/>
-        </w:rPr>
-        <w:t>To</w:t>
-      </w:r>
-      <w:proofErr w:type="gramEnd"/>
-      <w:r>
-        <w:rPr>
-          <w:rFonts w:ascii="Consolas" w:hAnsi="Consolas"/>
-          <w:color w:val="0070C0"/>
-          <w:sz w:val="22"/>
-          <w:szCs w:val="22"/>
-        </w:rPr>
-        <w:t xml:space="preserve"> Clip (output)</w:t>
+        <w:t>; -- Top Level Clock To Clip (output)</w:t>
       </w:r>
     </w:p>
     <w:p>
@@ -7602,7 +7446,6 @@
         <w:t xml:space="preserve">  signal </w:t>
       </w:r>
       <w:proofErr w:type="spellStart"/>
-      <w:proofErr w:type="gramStart"/>
       <w:r>
         <w:rPr>
           <w:rFonts w:ascii="Consolas" w:hAnsi="Consolas"/>
@@ -7620,17 +7463,7 @@
           <w:sz w:val="22"/>
           <w:szCs w:val="22"/>
         </w:rPr>
-        <w:t xml:space="preserve"> :</w:t>
-      </w:r>
-      <w:proofErr w:type="gramEnd"/>
-      <w:r>
-        <w:rPr>
-          <w:rFonts w:ascii="Consolas" w:hAnsi="Consolas"/>
-          <w:color w:val="0070C0"/>
-          <w:sz w:val="22"/>
-          <w:szCs w:val="22"/>
-        </w:rPr>
-        <w:t xml:space="preserve"> </w:t>
+        <w:t xml:space="preserve"> : </w:t>
       </w:r>
       <w:proofErr w:type="spellStart"/>
       <w:r>
@@ -7693,7 +7526,6 @@
         <w:t xml:space="preserve">  signal </w:t>
       </w:r>
       <w:proofErr w:type="spellStart"/>
-      <w:proofErr w:type="gramStart"/>
       <w:r>
         <w:rPr>
           <w:rFonts w:ascii="Consolas" w:hAnsi="Consolas"/>
@@ -7711,17 +7543,7 @@
           <w:sz w:val="22"/>
           <w:szCs w:val="22"/>
         </w:rPr>
-        <w:t xml:space="preserve"> :</w:t>
-      </w:r>
-      <w:proofErr w:type="gramEnd"/>
-      <w:r>
-        <w:rPr>
-          <w:rFonts w:ascii="Consolas" w:hAnsi="Consolas"/>
-          <w:color w:val="0070C0"/>
-          <w:sz w:val="22"/>
-          <w:szCs w:val="22"/>
-        </w:rPr>
-        <w:t xml:space="preserve"> </w:t>
+        <w:t xml:space="preserve"> : </w:t>
       </w:r>
       <w:proofErr w:type="spellStart"/>
       <w:r>
@@ -7769,7 +7591,7 @@
       <w:pPr>
         <w:pStyle w:val="Heading3"/>
       </w:pPr>
-      <w:bookmarkStart w:id="17" w:name="_Toc210041323"/>
+      <w:bookmarkStart w:id="17" w:name="_Toc210048130"/>
       <w:r>
         <w:t>Add Custom Board IO Signals to</w:t>
       </w:r>
@@ -7843,15 +7665,7 @@
     <w:p>
       <w:r>
         <w:lastRenderedPageBreak/>
-        <w:t xml:space="preserve">Copy </w:t>
-      </w:r>
-      <w:proofErr w:type="gramStart"/>
-      <w:r>
-        <w:t>all of</w:t>
-      </w:r>
-      <w:proofErr w:type="gramEnd"/>
-      <w:r>
-        <w:t xml:space="preserve"> the board IO port connections from the port map.  This may be difficult because t</w:t>
+        <w:t>Copy all of the board IO port connections from the port map.  This may be difficult because t</w:t>
       </w:r>
       <w:r>
         <w:t>his</w:t>
@@ -8374,15 +8188,7 @@
         <w:t xml:space="preserve">You might be wondering why we are copying </w:t>
       </w:r>
       <w:r>
-        <w:t xml:space="preserve">just the </w:t>
-      </w:r>
-      <w:proofErr w:type="gramStart"/>
-      <w:r>
-        <w:t>newly-added</w:t>
-      </w:r>
-      <w:proofErr w:type="gramEnd"/>
-      <w:r>
-        <w:t xml:space="preserve"> </w:t>
+        <w:t xml:space="preserve">just the newly-added </w:t>
       </w:r>
       <w:r>
         <w:t xml:space="preserve">board IO </w:t>
@@ -8426,23 +8232,7 @@
       </w:r>
       <w:proofErr w:type="spellEnd"/>
       <w:r>
-        <w:t xml:space="preserve"> that go to </w:t>
-      </w:r>
-      <w:proofErr w:type="gramStart"/>
-      <w:r>
-        <w:t>differently</w:t>
-      </w:r>
-      <w:proofErr w:type="gramEnd"/>
-      <w:r>
-        <w:t xml:space="preserve">-names </w:t>
-      </w:r>
-      <w:proofErr w:type="gramStart"/>
-      <w:r>
-        <w:t>signals</w:t>
-      </w:r>
-      <w:proofErr w:type="gramEnd"/>
-      <w:r>
-        <w:t xml:space="preserve"> and we do not want to break those</w:t>
+        <w:t xml:space="preserve"> that go to differently-names signals and we do not want to break those</w:t>
       </w:r>
       <w:r>
         <w:t>.</w:t>
@@ -8452,7 +8242,7 @@
       <w:pPr>
         <w:pStyle w:val="Heading3"/>
       </w:pPr>
-      <w:bookmarkStart w:id="18" w:name="_Toc210041324"/>
+      <w:bookmarkStart w:id="18" w:name="_Toc210048131"/>
       <w:r>
         <w:t xml:space="preserve">Disconnect the CLIP IO Socket Ports on </w:t>
       </w:r>
@@ -8476,15 +8266,7 @@
       </w:r>
       <w:proofErr w:type="spellEnd"/>
       <w:r>
-        <w:t xml:space="preserve">, there were </w:t>
-      </w:r>
-      <w:proofErr w:type="gramStart"/>
-      <w:r>
-        <w:t>a number of</w:t>
-      </w:r>
-      <w:proofErr w:type="gramEnd"/>
-      <w:r>
-        <w:t xml:space="preserve"> signals </w:t>
+        <w:t xml:space="preserve">, there were a number of signals </w:t>
       </w:r>
       <w:r>
         <w:t xml:space="preserve">connecting to it from the fixed-logic and ports on the top-level.  These signals passed through the ports on </w:t>
@@ -10457,7 +10239,7 @@
       <w:pPr>
         <w:pStyle w:val="Heading3"/>
       </w:pPr>
-      <w:bookmarkStart w:id="19" w:name="_Toc210041325"/>
+      <w:bookmarkStart w:id="19" w:name="_Toc210048132"/>
       <w:r>
         <w:t>Instantiate the Aurora CLIP</w:t>
       </w:r>
@@ -10583,7 +10365,7 @@
       <w:pPr>
         <w:pStyle w:val="Heading3"/>
       </w:pPr>
-      <w:bookmarkStart w:id="20" w:name="_Toc210041326"/>
+      <w:bookmarkStart w:id="20" w:name="_Toc210048133"/>
       <w:r>
         <w:t>Modify Aurora CLIP Signals</w:t>
       </w:r>
@@ -10591,15 +10373,7 @@
     </w:p>
     <w:p>
       <w:r>
-        <w:t xml:space="preserve">The CLIP instantiation example simply connects </w:t>
-      </w:r>
-      <w:proofErr w:type="gramStart"/>
-      <w:r>
-        <w:t>all of</w:t>
-      </w:r>
-      <w:proofErr w:type="gramEnd"/>
-      <w:r>
-        <w:t xml:space="preserve"> the ports to signals with the same name.  This works for most ports but some need to be connected to signals of different names.</w:t>
+        <w:t>The CLIP instantiation example simply connects all of the ports to signals with the same name.  This works for most ports but some need to be connected to signals of different names.</w:t>
       </w:r>
     </w:p>
     <w:p>
@@ -10980,21 +10754,8 @@
         <w:t xml:space="preserve"> need different port names</w:t>
       </w:r>
       <w:r>
-        <w:t xml:space="preserve"> and the CLIP AXI </w:t>
-      </w:r>
-      <w:proofErr w:type="gramStart"/>
-      <w:r>
-        <w:t>interrupt</w:t>
-      </w:r>
-      <w:proofErr w:type="gramEnd"/>
-      <w:r>
-        <w:t xml:space="preserve"> is not used (driven to ‘0’</w:t>
-      </w:r>
-      <w:proofErr w:type="gramStart"/>
-      <w:r>
-        <w:t>);</w:t>
-      </w:r>
-      <w:proofErr w:type="gramEnd"/>
+        <w:t xml:space="preserve"> and the CLIP AXI interrupt is not used (driven to ‘0’);</w:t>
+      </w:r>
     </w:p>
     <w:p>
       <w:pPr>
@@ -11743,115 +11504,70 @@
       </w:pPr>
     </w:p>
     <w:p>
-      <w:proofErr w:type="gramStart"/>
-      <w:r>
-        <w:t>Replace with</w:t>
-      </w:r>
-      <w:proofErr w:type="gramEnd"/>
-      <w:r>
-        <w:t xml:space="preserve"> this:</w:t>
-      </w:r>
-    </w:p>
-    <w:p>
-      <w:pPr>
-        <w:spacing w:after="0" w:line="276" w:lineRule="auto"/>
-        <w:rPr>
-          <w:rFonts w:ascii="Consolas" w:hAnsi="Consolas"/>
-          <w:color w:val="0070C0"/>
-          <w:sz w:val="22"/>
-          <w:szCs w:val="22"/>
-        </w:rPr>
-      </w:pPr>
-      <w:proofErr w:type="spellStart"/>
-      <w:r>
-        <w:rPr>
-          <w:rFonts w:ascii="Consolas" w:hAnsi="Consolas"/>
-          <w:color w:val="0070C0"/>
-          <w:sz w:val="22"/>
-          <w:szCs w:val="22"/>
-        </w:rPr>
-        <w:t>MgtPortRx_</w:t>
-      </w:r>
-      <w:proofErr w:type="gramStart"/>
-      <w:r>
-        <w:rPr>
-          <w:rFonts w:ascii="Consolas" w:hAnsi="Consolas"/>
-          <w:color w:val="0070C0"/>
-          <w:sz w:val="22"/>
-          <w:szCs w:val="22"/>
-        </w:rPr>
-        <w:t>n</w:t>
-      </w:r>
-      <w:proofErr w:type="spellEnd"/>
-      <w:r>
-        <w:rPr>
-          <w:rFonts w:ascii="Consolas" w:hAnsi="Consolas"/>
-          <w:color w:val="0070C0"/>
-          <w:sz w:val="22"/>
-          <w:szCs w:val="22"/>
-        </w:rPr>
-        <w:t>(</w:t>
-      </w:r>
-      <w:proofErr w:type="gramEnd"/>
-      <w:r>
-        <w:rPr>
-          <w:rFonts w:ascii="Consolas" w:hAnsi="Consolas"/>
-          <w:color w:val="0070C0"/>
-          <w:sz w:val="22"/>
-          <w:szCs w:val="22"/>
-        </w:rPr>
-        <w:t>0) =&gt; MgtPortRxLane0_n,</w:t>
-      </w:r>
-    </w:p>
-    <w:p>
-      <w:pPr>
-        <w:spacing w:after="0" w:line="276" w:lineRule="auto"/>
-        <w:rPr>
-          <w:rFonts w:ascii="Consolas" w:hAnsi="Consolas"/>
-          <w:color w:val="0070C0"/>
-          <w:sz w:val="22"/>
-          <w:szCs w:val="22"/>
-        </w:rPr>
-      </w:pPr>
-      <w:proofErr w:type="spellStart"/>
-      <w:r>
-        <w:rPr>
-          <w:rFonts w:ascii="Consolas" w:hAnsi="Consolas"/>
-          <w:color w:val="0070C0"/>
-          <w:sz w:val="22"/>
-          <w:szCs w:val="22"/>
-        </w:rPr>
-        <w:t>MgtPortRx_</w:t>
-      </w:r>
-      <w:proofErr w:type="gramStart"/>
-      <w:r>
-        <w:rPr>
-          <w:rFonts w:ascii="Consolas" w:hAnsi="Consolas"/>
-          <w:color w:val="0070C0"/>
-          <w:sz w:val="22"/>
-          <w:szCs w:val="22"/>
-        </w:rPr>
-        <w:t>n</w:t>
-      </w:r>
-      <w:proofErr w:type="spellEnd"/>
-      <w:r>
-        <w:rPr>
-          <w:rFonts w:ascii="Consolas" w:hAnsi="Consolas"/>
-          <w:color w:val="0070C0"/>
-          <w:sz w:val="22"/>
-          <w:szCs w:val="22"/>
-        </w:rPr>
-        <w:t>(</w:t>
-      </w:r>
-      <w:proofErr w:type="gramEnd"/>
-      <w:r>
-        <w:rPr>
-          <w:rFonts w:ascii="Consolas" w:hAnsi="Consolas"/>
-          <w:color w:val="0070C0"/>
-          <w:sz w:val="22"/>
-          <w:szCs w:val="22"/>
-        </w:rPr>
-        <w:t>1) =&gt; MgtPortRxLane1_n,</w:t>
+      <w:r>
+        <w:t>Replace with this:</w:t>
+      </w:r>
+    </w:p>
+    <w:p>
+      <w:pPr>
+        <w:spacing w:after="0" w:line="276" w:lineRule="auto"/>
+        <w:rPr>
+          <w:rFonts w:ascii="Consolas" w:hAnsi="Consolas"/>
+          <w:color w:val="0070C0"/>
+          <w:sz w:val="22"/>
+          <w:szCs w:val="22"/>
+        </w:rPr>
+      </w:pPr>
+      <w:proofErr w:type="spellStart"/>
+      <w:r>
+        <w:rPr>
+          <w:rFonts w:ascii="Consolas" w:hAnsi="Consolas"/>
+          <w:color w:val="0070C0"/>
+          <w:sz w:val="22"/>
+          <w:szCs w:val="22"/>
+        </w:rPr>
+        <w:t>MgtPortRx_n</w:t>
+      </w:r>
+      <w:proofErr w:type="spellEnd"/>
+      <w:r>
+        <w:rPr>
+          <w:rFonts w:ascii="Consolas" w:hAnsi="Consolas"/>
+          <w:color w:val="0070C0"/>
+          <w:sz w:val="22"/>
+          <w:szCs w:val="22"/>
+        </w:rPr>
+        <w:t>(0) =&gt; MgtPortRxLane0_n,</w:t>
+      </w:r>
+    </w:p>
+    <w:p>
+      <w:pPr>
+        <w:spacing w:after="0" w:line="276" w:lineRule="auto"/>
+        <w:rPr>
+          <w:rFonts w:ascii="Consolas" w:hAnsi="Consolas"/>
+          <w:color w:val="0070C0"/>
+          <w:sz w:val="22"/>
+          <w:szCs w:val="22"/>
+        </w:rPr>
+      </w:pPr>
+      <w:proofErr w:type="spellStart"/>
+      <w:r>
+        <w:rPr>
+          <w:rFonts w:ascii="Consolas" w:hAnsi="Consolas"/>
+          <w:color w:val="0070C0"/>
+          <w:sz w:val="22"/>
+          <w:szCs w:val="22"/>
+        </w:rPr>
+        <w:t>MgtPortRx_n</w:t>
+      </w:r>
+      <w:proofErr w:type="spellEnd"/>
+      <w:r>
+        <w:rPr>
+          <w:rFonts w:ascii="Consolas" w:hAnsi="Consolas"/>
+          <w:color w:val="0070C0"/>
+          <w:sz w:val="22"/>
+          <w:szCs w:val="22"/>
+        </w:rPr>
+        <w:t>(1) =&gt; MgtPortRxLane1_n,</w:t>
       </w:r>
     </w:p>
     <w:p>
@@ -11892,88 +11608,48 @@
           <w:sz w:val="22"/>
           <w:szCs w:val="22"/>
         </w:rPr>
-        <w:t>MgtPortRx_</w:t>
-      </w:r>
-      <w:proofErr w:type="gramStart"/>
-      <w:r>
-        <w:rPr>
-          <w:rFonts w:ascii="Consolas" w:hAnsi="Consolas"/>
-          <w:color w:val="0070C0"/>
-          <w:sz w:val="22"/>
-          <w:szCs w:val="22"/>
-        </w:rPr>
-        <w:t>p</w:t>
-      </w:r>
-      <w:proofErr w:type="spellEnd"/>
-      <w:r>
-        <w:rPr>
-          <w:rFonts w:ascii="Consolas" w:hAnsi="Consolas"/>
-          <w:color w:val="0070C0"/>
-          <w:sz w:val="22"/>
-          <w:szCs w:val="22"/>
-        </w:rPr>
-        <w:t>(</w:t>
-      </w:r>
-      <w:proofErr w:type="gramEnd"/>
-      <w:r>
-        <w:rPr>
-          <w:rFonts w:ascii="Consolas" w:hAnsi="Consolas"/>
-          <w:color w:val="0070C0"/>
-          <w:sz w:val="22"/>
-          <w:szCs w:val="22"/>
-        </w:rPr>
-        <w:t>0) =&gt; MgtPortRxLane0_p,</w:t>
-      </w:r>
-    </w:p>
-    <w:p>
-      <w:pPr>
-        <w:spacing w:after="0" w:line="276" w:lineRule="auto"/>
-        <w:rPr>
-          <w:rFonts w:ascii="Consolas" w:hAnsi="Consolas"/>
-          <w:color w:val="0070C0"/>
-          <w:sz w:val="22"/>
-          <w:szCs w:val="22"/>
-        </w:rPr>
-      </w:pPr>
-      <w:proofErr w:type="spellStart"/>
-      <w:r>
-        <w:rPr>
-          <w:rFonts w:ascii="Consolas" w:hAnsi="Consolas"/>
-          <w:color w:val="0070C0"/>
-          <w:sz w:val="22"/>
-          <w:szCs w:val="22"/>
-        </w:rPr>
-        <w:t>MgtPortRx_</w:t>
-      </w:r>
-      <w:proofErr w:type="gramStart"/>
-      <w:r>
-        <w:rPr>
-          <w:rFonts w:ascii="Consolas" w:hAnsi="Consolas"/>
-          <w:color w:val="0070C0"/>
-          <w:sz w:val="22"/>
-          <w:szCs w:val="22"/>
-        </w:rPr>
-        <w:t>p</w:t>
-      </w:r>
-      <w:proofErr w:type="spellEnd"/>
-      <w:r>
-        <w:rPr>
-          <w:rFonts w:ascii="Consolas" w:hAnsi="Consolas"/>
-          <w:color w:val="0070C0"/>
-          <w:sz w:val="22"/>
-          <w:szCs w:val="22"/>
-        </w:rPr>
-        <w:t>(</w:t>
-      </w:r>
-      <w:proofErr w:type="gramEnd"/>
-      <w:r>
-        <w:rPr>
-          <w:rFonts w:ascii="Consolas" w:hAnsi="Consolas"/>
-          <w:color w:val="0070C0"/>
-          <w:sz w:val="22"/>
-          <w:szCs w:val="22"/>
-        </w:rPr>
-        <w:t>1) =&gt; MgtPortRxLane1_p,</w:t>
+        <w:t>MgtPortRx_p</w:t>
+      </w:r>
+      <w:proofErr w:type="spellEnd"/>
+      <w:r>
+        <w:rPr>
+          <w:rFonts w:ascii="Consolas" w:hAnsi="Consolas"/>
+          <w:color w:val="0070C0"/>
+          <w:sz w:val="22"/>
+          <w:szCs w:val="22"/>
+        </w:rPr>
+        <w:t>(0) =&gt; MgtPortRxLane0_p,</w:t>
+      </w:r>
+    </w:p>
+    <w:p>
+      <w:pPr>
+        <w:spacing w:after="0" w:line="276" w:lineRule="auto"/>
+        <w:rPr>
+          <w:rFonts w:ascii="Consolas" w:hAnsi="Consolas"/>
+          <w:color w:val="0070C0"/>
+          <w:sz w:val="22"/>
+          <w:szCs w:val="22"/>
+        </w:rPr>
+      </w:pPr>
+      <w:proofErr w:type="spellStart"/>
+      <w:r>
+        <w:rPr>
+          <w:rFonts w:ascii="Consolas" w:hAnsi="Consolas"/>
+          <w:color w:val="0070C0"/>
+          <w:sz w:val="22"/>
+          <w:szCs w:val="22"/>
+        </w:rPr>
+        <w:t>MgtPortRx_p</w:t>
+      </w:r>
+      <w:proofErr w:type="spellEnd"/>
+      <w:r>
+        <w:rPr>
+          <w:rFonts w:ascii="Consolas" w:hAnsi="Consolas"/>
+          <w:color w:val="0070C0"/>
+          <w:sz w:val="22"/>
+          <w:szCs w:val="22"/>
+        </w:rPr>
+        <w:t>(1) =&gt; MgtPortRxLane1_p,</w:t>
       </w:r>
     </w:p>
     <w:p>
@@ -12015,88 +11691,48 @@
           <w:sz w:val="22"/>
           <w:szCs w:val="22"/>
         </w:rPr>
-        <w:t>MgtPortTx_</w:t>
-      </w:r>
-      <w:proofErr w:type="gramStart"/>
-      <w:r>
-        <w:rPr>
-          <w:rFonts w:ascii="Consolas" w:hAnsi="Consolas"/>
-          <w:color w:val="0070C0"/>
-          <w:sz w:val="22"/>
-          <w:szCs w:val="22"/>
-        </w:rPr>
-        <w:t>n</w:t>
-      </w:r>
-      <w:proofErr w:type="spellEnd"/>
-      <w:r>
-        <w:rPr>
-          <w:rFonts w:ascii="Consolas" w:hAnsi="Consolas"/>
-          <w:color w:val="0070C0"/>
-          <w:sz w:val="22"/>
-          <w:szCs w:val="22"/>
-        </w:rPr>
-        <w:t>(</w:t>
-      </w:r>
-      <w:proofErr w:type="gramEnd"/>
-      <w:r>
-        <w:rPr>
-          <w:rFonts w:ascii="Consolas" w:hAnsi="Consolas"/>
-          <w:color w:val="0070C0"/>
-          <w:sz w:val="22"/>
-          <w:szCs w:val="22"/>
-        </w:rPr>
-        <w:t>0) =&gt; MgtPortTxLane0_n,</w:t>
-      </w:r>
-    </w:p>
-    <w:p>
-      <w:pPr>
-        <w:spacing w:after="0" w:line="276" w:lineRule="auto"/>
-        <w:rPr>
-          <w:rFonts w:ascii="Consolas" w:hAnsi="Consolas"/>
-          <w:color w:val="0070C0"/>
-          <w:sz w:val="22"/>
-          <w:szCs w:val="22"/>
-        </w:rPr>
-      </w:pPr>
-      <w:proofErr w:type="spellStart"/>
-      <w:r>
-        <w:rPr>
-          <w:rFonts w:ascii="Consolas" w:hAnsi="Consolas"/>
-          <w:color w:val="0070C0"/>
-          <w:sz w:val="22"/>
-          <w:szCs w:val="22"/>
-        </w:rPr>
-        <w:t>MgtPortTx_</w:t>
-      </w:r>
-      <w:proofErr w:type="gramStart"/>
-      <w:r>
-        <w:rPr>
-          <w:rFonts w:ascii="Consolas" w:hAnsi="Consolas"/>
-          <w:color w:val="0070C0"/>
-          <w:sz w:val="22"/>
-          <w:szCs w:val="22"/>
-        </w:rPr>
-        <w:t>n</w:t>
-      </w:r>
-      <w:proofErr w:type="spellEnd"/>
-      <w:r>
-        <w:rPr>
-          <w:rFonts w:ascii="Consolas" w:hAnsi="Consolas"/>
-          <w:color w:val="0070C0"/>
-          <w:sz w:val="22"/>
-          <w:szCs w:val="22"/>
-        </w:rPr>
-        <w:t>(</w:t>
-      </w:r>
-      <w:proofErr w:type="gramEnd"/>
-      <w:r>
-        <w:rPr>
-          <w:rFonts w:ascii="Consolas" w:hAnsi="Consolas"/>
-          <w:color w:val="0070C0"/>
-          <w:sz w:val="22"/>
-          <w:szCs w:val="22"/>
-        </w:rPr>
-        <w:t>1) =&gt; MgtPortTxLane1_n,</w:t>
+        <w:t>MgtPortTx_n</w:t>
+      </w:r>
+      <w:proofErr w:type="spellEnd"/>
+      <w:r>
+        <w:rPr>
+          <w:rFonts w:ascii="Consolas" w:hAnsi="Consolas"/>
+          <w:color w:val="0070C0"/>
+          <w:sz w:val="22"/>
+          <w:szCs w:val="22"/>
+        </w:rPr>
+        <w:t>(0) =&gt; MgtPortTxLane0_n,</w:t>
+      </w:r>
+    </w:p>
+    <w:p>
+      <w:pPr>
+        <w:spacing w:after="0" w:line="276" w:lineRule="auto"/>
+        <w:rPr>
+          <w:rFonts w:ascii="Consolas" w:hAnsi="Consolas"/>
+          <w:color w:val="0070C0"/>
+          <w:sz w:val="22"/>
+          <w:szCs w:val="22"/>
+        </w:rPr>
+      </w:pPr>
+      <w:proofErr w:type="spellStart"/>
+      <w:r>
+        <w:rPr>
+          <w:rFonts w:ascii="Consolas" w:hAnsi="Consolas"/>
+          <w:color w:val="0070C0"/>
+          <w:sz w:val="22"/>
+          <w:szCs w:val="22"/>
+        </w:rPr>
+        <w:t>MgtPortTx_n</w:t>
+      </w:r>
+      <w:proofErr w:type="spellEnd"/>
+      <w:r>
+        <w:rPr>
+          <w:rFonts w:ascii="Consolas" w:hAnsi="Consolas"/>
+          <w:color w:val="0070C0"/>
+          <w:sz w:val="22"/>
+          <w:szCs w:val="22"/>
+        </w:rPr>
+        <w:t>(1) =&gt; MgtPortTxLane1_n,</w:t>
       </w:r>
     </w:p>
     <w:p>
@@ -12137,88 +11773,48 @@
           <w:sz w:val="22"/>
           <w:szCs w:val="22"/>
         </w:rPr>
-        <w:t>MgtPortTx_</w:t>
-      </w:r>
-      <w:proofErr w:type="gramStart"/>
-      <w:r>
-        <w:rPr>
-          <w:rFonts w:ascii="Consolas" w:hAnsi="Consolas"/>
-          <w:color w:val="0070C0"/>
-          <w:sz w:val="22"/>
-          <w:szCs w:val="22"/>
-        </w:rPr>
-        <w:t>p</w:t>
-      </w:r>
-      <w:proofErr w:type="spellEnd"/>
-      <w:r>
-        <w:rPr>
-          <w:rFonts w:ascii="Consolas" w:hAnsi="Consolas"/>
-          <w:color w:val="0070C0"/>
-          <w:sz w:val="22"/>
-          <w:szCs w:val="22"/>
-        </w:rPr>
-        <w:t>(</w:t>
-      </w:r>
-      <w:proofErr w:type="gramEnd"/>
-      <w:r>
-        <w:rPr>
-          <w:rFonts w:ascii="Consolas" w:hAnsi="Consolas"/>
-          <w:color w:val="0070C0"/>
-          <w:sz w:val="22"/>
-          <w:szCs w:val="22"/>
-        </w:rPr>
-        <w:t>0) =&gt; MgtPortTxLane0_p,</w:t>
-      </w:r>
-    </w:p>
-    <w:p>
-      <w:pPr>
-        <w:spacing w:after="0" w:line="276" w:lineRule="auto"/>
-        <w:rPr>
-          <w:rFonts w:ascii="Consolas" w:hAnsi="Consolas"/>
-          <w:color w:val="0070C0"/>
-          <w:sz w:val="22"/>
-          <w:szCs w:val="22"/>
-        </w:rPr>
-      </w:pPr>
-      <w:proofErr w:type="spellStart"/>
-      <w:r>
-        <w:rPr>
-          <w:rFonts w:ascii="Consolas" w:hAnsi="Consolas"/>
-          <w:color w:val="0070C0"/>
-          <w:sz w:val="22"/>
-          <w:szCs w:val="22"/>
-        </w:rPr>
-        <w:t>MgtPortTx_</w:t>
-      </w:r>
-      <w:proofErr w:type="gramStart"/>
-      <w:r>
-        <w:rPr>
-          <w:rFonts w:ascii="Consolas" w:hAnsi="Consolas"/>
-          <w:color w:val="0070C0"/>
-          <w:sz w:val="22"/>
-          <w:szCs w:val="22"/>
-        </w:rPr>
-        <w:t>p</w:t>
-      </w:r>
-      <w:proofErr w:type="spellEnd"/>
-      <w:r>
-        <w:rPr>
-          <w:rFonts w:ascii="Consolas" w:hAnsi="Consolas"/>
-          <w:color w:val="0070C0"/>
-          <w:sz w:val="22"/>
-          <w:szCs w:val="22"/>
-        </w:rPr>
-        <w:t>(</w:t>
-      </w:r>
-      <w:proofErr w:type="gramEnd"/>
-      <w:r>
-        <w:rPr>
-          <w:rFonts w:ascii="Consolas" w:hAnsi="Consolas"/>
-          <w:color w:val="0070C0"/>
-          <w:sz w:val="22"/>
-          <w:szCs w:val="22"/>
-        </w:rPr>
-        <w:t>1) =&gt; MgtPortTxLane1_p,</w:t>
+        <w:t>MgtPortTx_p</w:t>
+      </w:r>
+      <w:proofErr w:type="spellEnd"/>
+      <w:r>
+        <w:rPr>
+          <w:rFonts w:ascii="Consolas" w:hAnsi="Consolas"/>
+          <w:color w:val="0070C0"/>
+          <w:sz w:val="22"/>
+          <w:szCs w:val="22"/>
+        </w:rPr>
+        <w:t>(0) =&gt; MgtPortTxLane0_p,</w:t>
+      </w:r>
+    </w:p>
+    <w:p>
+      <w:pPr>
+        <w:spacing w:after="0" w:line="276" w:lineRule="auto"/>
+        <w:rPr>
+          <w:rFonts w:ascii="Consolas" w:hAnsi="Consolas"/>
+          <w:color w:val="0070C0"/>
+          <w:sz w:val="22"/>
+          <w:szCs w:val="22"/>
+        </w:rPr>
+      </w:pPr>
+      <w:proofErr w:type="spellStart"/>
+      <w:r>
+        <w:rPr>
+          <w:rFonts w:ascii="Consolas" w:hAnsi="Consolas"/>
+          <w:color w:val="0070C0"/>
+          <w:sz w:val="22"/>
+          <w:szCs w:val="22"/>
+        </w:rPr>
+        <w:t>MgtPortTx_p</w:t>
+      </w:r>
+      <w:proofErr w:type="spellEnd"/>
+      <w:r>
+        <w:rPr>
+          <w:rFonts w:ascii="Consolas" w:hAnsi="Consolas"/>
+          <w:color w:val="0070C0"/>
+          <w:sz w:val="22"/>
+          <w:szCs w:val="22"/>
+        </w:rPr>
+        <w:t>(1) =&gt; MgtPortTxLane1_p,</w:t>
       </w:r>
     </w:p>
     <w:p/>
@@ -12235,7 +11831,7 @@
       <w:pPr>
         <w:pStyle w:val="Heading3"/>
       </w:pPr>
-      <w:bookmarkStart w:id="21" w:name="_Toc210041327"/>
+      <w:bookmarkStart w:id="21" w:name="_Toc210048134"/>
       <w:r>
         <w:t>(Optional) Compare Against FlexRIO-Custom example</w:t>
       </w:r>
@@ -12276,7 +11872,7 @@
       <w:pPr>
         <w:pStyle w:val="Heading2"/>
       </w:pPr>
-      <w:bookmarkStart w:id="22" w:name="_Toc210041328"/>
+      <w:bookmarkStart w:id="22" w:name="_Toc210048135"/>
       <w:r>
         <w:t>Copy</w:t>
       </w:r>
@@ -12344,15 +11940,7 @@
         <w:t>” because this file is processed by LabVIEW FPGA to insert constraints</w:t>
       </w:r>
       <w:r>
-        <w:t xml:space="preserve"> for CLIPs and the LabVIEW VI.  The LabVIEW FPGA HDL Tools also processes </w:t>
-      </w:r>
-      <w:proofErr w:type="gramStart"/>
-      <w:r>
-        <w:t>this</w:t>
-      </w:r>
-      <w:proofErr w:type="gramEnd"/>
-      <w:r>
-        <w:t xml:space="preserve"> constraints template to insert constraints from the LabVIEW VI.</w:t>
+        <w:t xml:space="preserve"> for CLIPs and the LabVIEW VI.  The LabVIEW FPGA HDL Tools also processes this constraints template to insert constraints from the LabVIEW VI.</w:t>
       </w:r>
       <w:r>
         <w:t xml:space="preserve">  But because we are manually inserting the CLIP HDL into the FPGA’s top-level entity, we must also manually insert the CLIP constraints into the XDC template file.</w:t>
@@ -12485,7 +12073,7 @@
       <w:pPr>
         <w:pStyle w:val="Heading2"/>
       </w:pPr>
-      <w:bookmarkStart w:id="23" w:name="_Toc210041329"/>
+      <w:bookmarkStart w:id="23" w:name="_Toc210048136"/>
       <w:r>
         <w:t>Add the CLIP HDL to the Vivado Project Sources</w:t>
       </w:r>
@@ -12736,15 +12324,7 @@
     </w:p>
     <w:p>
       <w:r>
-        <w:t xml:space="preserve">In the projectsettings.ini file, add </w:t>
-      </w:r>
-      <w:proofErr w:type="gramStart"/>
-      <w:r>
-        <w:t>this new sources</w:t>
-      </w:r>
-      <w:proofErr w:type="gramEnd"/>
-      <w:r>
-        <w:t xml:space="preserve"> file to the </w:t>
+        <w:t xml:space="preserve">In the projectsettings.ini file, add this new sources file to the </w:t>
       </w:r>
       <w:proofErr w:type="spellStart"/>
       <w:r>
@@ -12894,7 +12474,7 @@
       <w:pPr>
         <w:pStyle w:val="Heading2"/>
       </w:pPr>
-      <w:bookmarkStart w:id="24" w:name="_Toc210041330"/>
+      <w:bookmarkStart w:id="24" w:name="_Toc210048137"/>
       <w:r>
         <w:t>Synthesize the Customized FPGA Target</w:t>
       </w:r>
@@ -13005,15 +12585,7 @@
     <w:p/>
     <w:p>
       <w:r>
-        <w:t xml:space="preserve">This will synthesize the design to ensure that </w:t>
-      </w:r>
-      <w:proofErr w:type="gramStart"/>
-      <w:r>
-        <w:t>all of</w:t>
-      </w:r>
-      <w:proofErr w:type="gramEnd"/>
-      <w:r>
-        <w:t xml:space="preserve"> the ports are properly connected.  You may encounter errors.  The easiest way to </w:t>
+        <w:t xml:space="preserve">This will synthesize the design to ensure that all of the ports are properly connected.  You may encounter errors.  The easiest way to </w:t>
       </w:r>
       <w:r>
         <w:t>debug them is to open the runme.log file in the synthesis run folder:</w:t>
@@ -13048,22 +12620,14 @@
         <w:t xml:space="preserve">run Implementation to debug any errors in that stage.  Note that the generated bitfile will not be fully functional because you have not yet imported a netlist for the LabVIEW </w:t>
       </w:r>
       <w:r>
-        <w:t xml:space="preserve">window.  </w:t>
-      </w:r>
-      <w:proofErr w:type="gramStart"/>
-      <w:r>
-        <w:t>The LabVIEW</w:t>
-      </w:r>
-      <w:proofErr w:type="gramEnd"/>
-      <w:r>
-        <w:t xml:space="preserve"> FPGA VI is necessary to control the MGTs and communicate with the host PC.</w:t>
+        <w:t>window.  The LabVIEW FPGA VI is necessary to control the MGTs and communicate with the host PC.</w:t>
       </w:r>
     </w:p>
     <w:p>
       <w:pPr>
         <w:pStyle w:val="Heading2"/>
       </w:pPr>
-      <w:bookmarkStart w:id="25" w:name="_Toc210041331"/>
+      <w:bookmarkStart w:id="25" w:name="_Toc210048138"/>
       <w:r>
         <w:t>Create Custom LabVIEW FPGA Target</w:t>
       </w:r>
@@ -13073,7 +12637,7 @@
       <w:pPr>
         <w:pStyle w:val="Heading3"/>
       </w:pPr>
-      <w:bookmarkStart w:id="26" w:name="_Toc210041332"/>
+      <w:bookmarkStart w:id="26" w:name="_Toc210048139"/>
       <w:r>
         <w:t xml:space="preserve">Modify </w:t>
       </w:r>
@@ -13139,7 +12703,7 @@
       <w:r>
         <w:t xml:space="preserve"> </w:t>
       </w:r>
-      <w:hyperlink r:id="rId15" w:history="1">
+      <w:hyperlink r:id="rId18" w:history="1">
         <w:r>
           <w:rPr>
             <w:rStyle w:val="Hyperlink"/>
@@ -13169,7 +12733,7 @@
                     <pic:cNvPicPr/>
                   </pic:nvPicPr>
                   <pic:blipFill>
-                    <a:blip r:embed="rId16"/>
+                    <a:blip r:embed="rId19"/>
                     <a:stretch>
                       <a:fillRect/>
                     </a:stretch>
@@ -13242,7 +12806,7 @@
       <w:pPr>
         <w:pStyle w:val="Heading3"/>
       </w:pPr>
-      <w:bookmarkStart w:id="27" w:name="_Toc210041333"/>
+      <w:bookmarkStart w:id="27" w:name="_Toc210048140"/>
       <w:r>
         <w:lastRenderedPageBreak/>
         <w:t>Generate and Install the Custom Target</w:t>
@@ -13378,7 +12942,7 @@
       <w:pPr>
         <w:pStyle w:val="Heading2"/>
       </w:pPr>
-      <w:bookmarkStart w:id="28" w:name="_Toc210041334"/>
+      <w:bookmarkStart w:id="28" w:name="_Toc210048141"/>
       <w:r>
         <w:t>Create the</w:t>
       </w:r>
@@ -13397,7 +12961,7 @@
       <w:pPr>
         <w:pStyle w:val="Heading3"/>
       </w:pPr>
-      <w:bookmarkStart w:id="29" w:name="_Toc210041335"/>
+      <w:bookmarkStart w:id="29" w:name="_Toc210048142"/>
       <w:r>
         <w:t>Create a LabVIEW FPGA project for the new custom target</w:t>
       </w:r>
@@ -13438,7 +13002,7 @@
                     <pic:cNvPicPr/>
                   </pic:nvPicPr>
                   <pic:blipFill>
-                    <a:blip r:embed="rId17"/>
+                    <a:blip r:embed="rId20"/>
                     <a:stretch>
                       <a:fillRect/>
                     </a:stretch>
@@ -13462,15 +13026,7 @@
     <w:p/>
     <w:p>
       <w:r>
-        <w:t xml:space="preserve">Add </w:t>
-      </w:r>
-      <w:proofErr w:type="gramStart"/>
-      <w:r>
-        <w:t>all of</w:t>
-      </w:r>
-      <w:proofErr w:type="gramEnd"/>
-      <w:r>
-        <w:t xml:space="preserve"> the custom board IO to the FPGA target:</w:t>
+        <w:t>Add all of the custom board IO to the FPGA target:</w:t>
       </w:r>
     </w:p>
     <w:p>
@@ -13494,7 +13050,7 @@
                     <pic:cNvPicPr/>
                   </pic:nvPicPr>
                   <pic:blipFill>
-                    <a:blip r:embed="rId18"/>
+                    <a:blip r:embed="rId21"/>
                     <a:stretch>
                       <a:fillRect/>
                     </a:stretch>
@@ -13542,7 +13098,7 @@
                     <pic:cNvPicPr/>
                   </pic:nvPicPr>
                   <pic:blipFill>
-                    <a:blip r:embed="rId19"/>
+                    <a:blip r:embed="rId22"/>
                     <a:stretch>
                       <a:fillRect/>
                     </a:stretch>
@@ -13575,7 +13131,7 @@
       <w:pPr>
         <w:pStyle w:val="Heading3"/>
       </w:pPr>
-      <w:bookmarkStart w:id="30" w:name="_Toc210041336"/>
+      <w:bookmarkStart w:id="30" w:name="_Toc210048143"/>
       <w:r>
         <w:lastRenderedPageBreak/>
         <w:t>Create the Aurora Shipping Example Project for the PXIe-7903</w:t>
@@ -13613,7 +13169,7 @@
                     <pic:cNvPicPr/>
                   </pic:nvPicPr>
                   <pic:blipFill>
-                    <a:blip r:embed="rId20"/>
+                    <a:blip r:embed="rId23"/>
                     <a:stretch>
                       <a:fillRect/>
                     </a:stretch>
@@ -13661,7 +13217,7 @@
                     <pic:cNvPicPr/>
                   </pic:nvPicPr>
                   <pic:blipFill>
-                    <a:blip r:embed="rId21"/>
+                    <a:blip r:embed="rId24"/>
                     <a:stretch>
                       <a:fillRect/>
                     </a:stretch>
@@ -13706,7 +13262,7 @@
       <w:pPr>
         <w:pStyle w:val="Heading3"/>
       </w:pPr>
-      <w:bookmarkStart w:id="31" w:name="_Toc210041337"/>
+      <w:bookmarkStart w:id="31" w:name="_Toc210048144"/>
       <w:r>
         <w:t>Copy</w:t>
       </w:r>
@@ -13742,7 +13298,7 @@
                     <pic:cNvPicPr/>
                   </pic:nvPicPr>
                   <pic:blipFill>
-                    <a:blip r:embed="rId22"/>
+                    <a:blip r:embed="rId25"/>
                     <a:stretch>
                       <a:fillRect/>
                     </a:stretch>
@@ -13883,7 +13439,7 @@
       <w:pPr>
         <w:pStyle w:val="Heading3"/>
       </w:pPr>
-      <w:bookmarkStart w:id="32" w:name="_Toc210041338"/>
+      <w:bookmarkStart w:id="32" w:name="_Toc210048145"/>
       <w:r>
         <w:t>Add the Dummy CLIP</w:t>
       </w:r>
@@ -14003,7 +13559,7 @@
                     <pic:cNvPicPr/>
                   </pic:nvPicPr>
                   <pic:blipFill>
-                    <a:blip r:embed="rId23"/>
+                    <a:blip r:embed="rId26"/>
                     <a:stretch>
                       <a:fillRect/>
                     </a:stretch>
@@ -14076,7 +13632,7 @@
                     <pic:cNvPicPr/>
                   </pic:nvPicPr>
                   <pic:blipFill>
-                    <a:blip r:embed="rId24"/>
+                    <a:blip r:embed="rId27"/>
                     <a:stretch>
                       <a:fillRect/>
                     </a:stretch>
@@ -14102,7 +13658,7 @@
       <w:pPr>
         <w:pStyle w:val="Heading2"/>
       </w:pPr>
-      <w:bookmarkStart w:id="33" w:name="_Toc210041339"/>
+      <w:bookmarkStart w:id="33" w:name="_Toc210048146"/>
       <w:r>
         <w:lastRenderedPageBreak/>
         <w:t>Modify the FPGA VI IO Constants</w:t>
@@ -14137,15 +13693,7 @@
       </w:r>
       <w:proofErr w:type="spellEnd"/>
       <w:r>
-        <w:t xml:space="preserve"> CSV file with periods.  You will need to re-select </w:t>
-      </w:r>
-      <w:proofErr w:type="gramStart"/>
-      <w:r>
-        <w:t>all of</w:t>
-      </w:r>
-      <w:proofErr w:type="gramEnd"/>
-      <w:r>
-        <w:t xml:space="preserve"> the FPGA IO in the VI to use these new IO names.</w:t>
+        <w:t xml:space="preserve"> CSV file with periods.  You will need to re-select all of the FPGA IO in the VI to use these new IO names.</w:t>
       </w:r>
     </w:p>
     <w:p>
@@ -14198,7 +13746,7 @@
                     <pic:cNvPicPr/>
                   </pic:nvPicPr>
                   <pic:blipFill>
-                    <a:blip r:embed="rId25"/>
+                    <a:blip r:embed="rId28"/>
                     <a:stretch>
                       <a:fillRect/>
                     </a:stretch>
@@ -14222,15 +13770,7 @@
     <w:p/>
     <w:p>
       <w:r>
-        <w:t xml:space="preserve">Open </w:t>
-      </w:r>
-      <w:proofErr w:type="gramStart"/>
-      <w:r>
-        <w:t>the Port0</w:t>
-      </w:r>
-      <w:proofErr w:type="gramEnd"/>
-      <w:r>
-        <w:t xml:space="preserve"> Constructor VI</w:t>
+        <w:t>Open the Port0 Constructor VI</w:t>
       </w:r>
       <w:r>
         <w:t>:</w:t>
@@ -14257,7 +13797,7 @@
                     <pic:cNvPicPr/>
                   </pic:nvPicPr>
                   <pic:blipFill>
-                    <a:blip r:embed="rId26"/>
+                    <a:blip r:embed="rId29"/>
                     <a:stretch>
                       <a:fillRect/>
                     </a:stretch>
@@ -14306,7 +13846,7 @@
                     <pic:cNvPicPr/>
                   </pic:nvPicPr>
                   <pic:blipFill>
-                    <a:blip r:embed="rId27"/>
+                    <a:blip r:embed="rId30"/>
                     <a:stretch>
                       <a:fillRect/>
                     </a:stretch>
@@ -14330,15 +13870,7 @@
     <w:p/>
     <w:p>
       <w:r>
-        <w:t xml:space="preserve">In this constant, </w:t>
-      </w:r>
-      <w:proofErr w:type="gramStart"/>
-      <w:r>
-        <w:t>all of</w:t>
-      </w:r>
-      <w:proofErr w:type="gramEnd"/>
-      <w:r>
-        <w:t xml:space="preserve"> the backslashes need to be replaced with periods</w:t>
+        <w:t>In this constant, all of the backslashes need to be replaced with periods</w:t>
       </w:r>
       <w:r>
         <w:t>:</w:t>
@@ -14365,7 +13897,7 @@
                     <pic:cNvPicPr/>
                   </pic:nvPicPr>
                   <pic:blipFill>
-                    <a:blip r:embed="rId28"/>
+                    <a:blip r:embed="rId31"/>
                     <a:stretch>
                       <a:fillRect/>
                     </a:stretch>
@@ -14427,15 +13959,7 @@
         <w:t xml:space="preserve">Note: If you want to save time, you can </w:t>
       </w:r>
       <w:r>
-        <w:t>only update ports 0 and 1</w:t>
-      </w:r>
-      <w:proofErr w:type="gramStart"/>
-      <w:r>
-        <w:t>.  And</w:t>
-      </w:r>
-      <w:proofErr w:type="gramEnd"/>
-      <w:r>
-        <w:t xml:space="preserve"> then in the FPGA top-level VI, delete the constructor </w:t>
+        <w:t xml:space="preserve">only update ports 0 and 1.  And then in the FPGA top-level VI, delete the constructor </w:t>
       </w:r>
       <w:proofErr w:type="spellStart"/>
       <w:r>
@@ -14454,7 +13978,7 @@
       <w:pPr>
         <w:pStyle w:val="Heading2"/>
       </w:pPr>
-      <w:bookmarkStart w:id="34" w:name="_Toc210041340"/>
+      <w:bookmarkStart w:id="34" w:name="_Toc210048147"/>
       <w:r>
         <w:t>Export LabVIEW FPGA Window Netlist</w:t>
       </w:r>
@@ -14480,7 +14004,7 @@
       <w:pPr>
         <w:pStyle w:val="Heading3"/>
       </w:pPr>
-      <w:bookmarkStart w:id="35" w:name="_Toc210041341"/>
+      <w:bookmarkStart w:id="35" w:name="_Toc210048148"/>
       <w:r>
         <w:t>Vivado Project Export</w:t>
       </w:r>
@@ -14523,7 +14047,7 @@
                     <pic:cNvPicPr/>
                   </pic:nvPicPr>
                   <pic:blipFill>
-                    <a:blip r:embed="rId29"/>
+                    <a:blip r:embed="rId32"/>
                     <a:stretch>
                       <a:fillRect/>
                     </a:stretch>
@@ -14553,7 +14077,7 @@
       <w:pPr>
         <w:pStyle w:val="Heading3"/>
       </w:pPr>
-      <w:bookmarkStart w:id="36" w:name="_Toc210041342"/>
+      <w:bookmarkStart w:id="36" w:name="_Toc210048149"/>
       <w:r>
         <w:t>Get the Netlist for The Window</w:t>
       </w:r>
@@ -14858,7 +14382,7 @@
       <w:pPr>
         <w:pStyle w:val="Heading2"/>
       </w:pPr>
-      <w:bookmarkStart w:id="37" w:name="_Toc210041343"/>
+      <w:bookmarkStart w:id="37" w:name="_Toc210048150"/>
       <w:r>
         <w:t>Build Custom FPGA Bitfile in Vivado</w:t>
       </w:r>
@@ -15207,18 +14731,13 @@
       </w:r>
       <w:proofErr w:type="spellEnd"/>
       <w:r>
-        <w:t xml:space="preserve"> command is automatically run as a post implementation step.  That command will pack the Xilinx bitstream file into </w:t>
-      </w:r>
-      <w:proofErr w:type="gramStart"/>
-      <w:r>
-        <w:t>the .</w:t>
+        <w:t xml:space="preserve"> command is automatically run as a post implementation step.  That command will pack the Xilinx bitstream file into the .</w:t>
       </w:r>
       <w:proofErr w:type="spellStart"/>
       <w:r>
         <w:t>lvbitx</w:t>
       </w:r>
       <w:proofErr w:type="spellEnd"/>
-      <w:proofErr w:type="gramEnd"/>
       <w:r>
         <w:t xml:space="preserve"> file used by the NI-RIO driver.</w:t>
       </w:r>
@@ -15233,18 +14752,13 @@
         <w:spacing w:after="0" w:line="276" w:lineRule="auto"/>
       </w:pPr>
       <w:r>
-        <w:t xml:space="preserve">You can find the </w:t>
-      </w:r>
-      <w:proofErr w:type="gramStart"/>
-      <w:r>
-        <w:t>generated .</w:t>
+        <w:t>You can find the generated .</w:t>
       </w:r>
       <w:proofErr w:type="spellStart"/>
       <w:r>
         <w:t>lvbitx</w:t>
       </w:r>
       <w:proofErr w:type="spellEnd"/>
-      <w:proofErr w:type="gramEnd"/>
       <w:r>
         <w:t xml:space="preserve"> file here:</w:t>
       </w:r>
@@ -15283,7 +14797,7 @@
       <w:pPr>
         <w:pStyle w:val="Heading2"/>
       </w:pPr>
-      <w:bookmarkStart w:id="38" w:name="_Toc210041344"/>
+      <w:bookmarkStart w:id="38" w:name="_Toc210048151"/>
       <w:r>
         <w:t>Run the Host example</w:t>
       </w:r>

</xml_diff>

<commit_message>
updated lv fpga tools version
</commit_message>
<xml_diff>
--- a/docs/public/HDL Workflow Hands-On Guide.docx
+++ b/docs/public/HDL Workflow Hands-On Guide.docx
@@ -77,7 +77,7 @@
           <w:r>
             <w:fldChar w:fldCharType="separate"/>
           </w:r>
-          <w:hyperlink w:anchor="_Toc210976409" w:history="1">
+          <w:hyperlink w:anchor="_Toc211263252" w:history="1">
             <w:r>
               <w:rPr>
                 <w:rStyle w:val="Hyperlink"/>
@@ -118,7 +118,7 @@
                 <w:noProof/>
                 <w:webHidden/>
               </w:rPr>
-              <w:instrText xml:space="preserve"> PAGEREF _Toc210976409 \h </w:instrText>
+              <w:instrText xml:space="preserve"> PAGEREF _Toc211263252 \h </w:instrText>
             </w:r>
             <w:r>
               <w:rPr>
@@ -161,7 +161,7 @@
               <w:noProof/>
             </w:rPr>
           </w:pPr>
-          <w:hyperlink w:anchor="_Toc210976410" w:history="1">
+          <w:hyperlink w:anchor="_Toc211263253" w:history="1">
             <w:r>
               <w:rPr>
                 <w:rStyle w:val="Hyperlink"/>
@@ -202,7 +202,7 @@
                 <w:noProof/>
                 <w:webHidden/>
               </w:rPr>
-              <w:instrText xml:space="preserve"> PAGEREF _Toc210976410 \h </w:instrText>
+              <w:instrText xml:space="preserve"> PAGEREF _Toc211263253 \h </w:instrText>
             </w:r>
             <w:r>
               <w:rPr>
@@ -245,7 +245,7 @@
               <w:noProof/>
             </w:rPr>
           </w:pPr>
-          <w:hyperlink w:anchor="_Toc210976411" w:history="1">
+          <w:hyperlink w:anchor="_Toc211263254" w:history="1">
             <w:r>
               <w:rPr>
                 <w:rStyle w:val="Hyperlink"/>
@@ -286,7 +286,7 @@
                 <w:noProof/>
                 <w:webHidden/>
               </w:rPr>
-              <w:instrText xml:space="preserve"> PAGEREF _Toc210976411 \h </w:instrText>
+              <w:instrText xml:space="preserve"> PAGEREF _Toc211263254 \h </w:instrText>
             </w:r>
             <w:r>
               <w:rPr>
@@ -329,7 +329,7 @@
               <w:noProof/>
             </w:rPr>
           </w:pPr>
-          <w:hyperlink w:anchor="_Toc210976412" w:history="1">
+          <w:hyperlink w:anchor="_Toc211263255" w:history="1">
             <w:r>
               <w:rPr>
                 <w:rStyle w:val="Hyperlink"/>
@@ -370,7 +370,7 @@
                 <w:noProof/>
                 <w:webHidden/>
               </w:rPr>
-              <w:instrText xml:space="preserve"> PAGEREF _Toc210976412 \h </w:instrText>
+              <w:instrText xml:space="preserve"> PAGEREF _Toc211263255 \h </w:instrText>
             </w:r>
             <w:r>
               <w:rPr>
@@ -413,7 +413,7 @@
               <w:noProof/>
             </w:rPr>
           </w:pPr>
-          <w:hyperlink w:anchor="_Toc210976413" w:history="1">
+          <w:hyperlink w:anchor="_Toc211263256" w:history="1">
             <w:r>
               <w:rPr>
                 <w:rStyle w:val="Hyperlink"/>
@@ -454,7 +454,7 @@
                 <w:noProof/>
                 <w:webHidden/>
               </w:rPr>
-              <w:instrText xml:space="preserve"> PAGEREF _Toc210976413 \h </w:instrText>
+              <w:instrText xml:space="preserve"> PAGEREF _Toc211263256 \h </w:instrText>
             </w:r>
             <w:r>
               <w:rPr>
@@ -497,7 +497,7 @@
               <w:noProof/>
             </w:rPr>
           </w:pPr>
-          <w:hyperlink w:anchor="_Toc210976414" w:history="1">
+          <w:hyperlink w:anchor="_Toc211263257" w:history="1">
             <w:r>
               <w:rPr>
                 <w:rStyle w:val="Hyperlink"/>
@@ -538,7 +538,7 @@
                 <w:noProof/>
                 <w:webHidden/>
               </w:rPr>
-              <w:instrText xml:space="preserve"> PAGEREF _Toc210976414 \h </w:instrText>
+              <w:instrText xml:space="preserve"> PAGEREF _Toc211263257 \h </w:instrText>
             </w:r>
             <w:r>
               <w:rPr>
@@ -581,7 +581,7 @@
               <w:noProof/>
             </w:rPr>
           </w:pPr>
-          <w:hyperlink w:anchor="_Toc210976415" w:history="1">
+          <w:hyperlink w:anchor="_Toc211263258" w:history="1">
             <w:r>
               <w:rPr>
                 <w:rStyle w:val="Hyperlink"/>
@@ -622,7 +622,7 @@
                 <w:noProof/>
                 <w:webHidden/>
               </w:rPr>
-              <w:instrText xml:space="preserve"> PAGEREF _Toc210976415 \h </w:instrText>
+              <w:instrText xml:space="preserve"> PAGEREF _Toc211263258 \h </w:instrText>
             </w:r>
             <w:r>
               <w:rPr>
@@ -665,7 +665,7 @@
               <w:noProof/>
             </w:rPr>
           </w:pPr>
-          <w:hyperlink w:anchor="_Toc210976416" w:history="1">
+          <w:hyperlink w:anchor="_Toc211263259" w:history="1">
             <w:r>
               <w:rPr>
                 <w:rStyle w:val="Hyperlink"/>
@@ -706,7 +706,7 @@
                 <w:noProof/>
                 <w:webHidden/>
               </w:rPr>
-              <w:instrText xml:space="preserve"> PAGEREF _Toc210976416 \h </w:instrText>
+              <w:instrText xml:space="preserve"> PAGEREF _Toc211263259 \h </w:instrText>
             </w:r>
             <w:r>
               <w:rPr>
@@ -749,7 +749,7 @@
               <w:noProof/>
             </w:rPr>
           </w:pPr>
-          <w:hyperlink w:anchor="_Toc210976417" w:history="1">
+          <w:hyperlink w:anchor="_Toc211263260" w:history="1">
             <w:r>
               <w:rPr>
                 <w:rStyle w:val="Hyperlink"/>
@@ -790,7 +790,7 @@
                 <w:noProof/>
                 <w:webHidden/>
               </w:rPr>
-              <w:instrText xml:space="preserve"> PAGEREF _Toc210976417 \h </w:instrText>
+              <w:instrText xml:space="preserve"> PAGEREF _Toc211263260 \h </w:instrText>
             </w:r>
             <w:r>
               <w:rPr>
@@ -833,7 +833,7 @@
               <w:noProof/>
             </w:rPr>
           </w:pPr>
-          <w:hyperlink w:anchor="_Toc210976418" w:history="1">
+          <w:hyperlink w:anchor="_Toc211263261" w:history="1">
             <w:r>
               <w:rPr>
                 <w:rStyle w:val="Hyperlink"/>
@@ -874,7 +874,7 @@
                 <w:noProof/>
                 <w:webHidden/>
               </w:rPr>
-              <w:instrText xml:space="preserve"> PAGEREF _Toc210976418 \h </w:instrText>
+              <w:instrText xml:space="preserve"> PAGEREF _Toc211263261 \h </w:instrText>
             </w:r>
             <w:r>
               <w:rPr>
@@ -917,7 +917,7 @@
               <w:noProof/>
             </w:rPr>
           </w:pPr>
-          <w:hyperlink w:anchor="_Toc210976419" w:history="1">
+          <w:hyperlink w:anchor="_Toc211263262" w:history="1">
             <w:r>
               <w:rPr>
                 <w:rStyle w:val="Hyperlink"/>
@@ -958,7 +958,7 @@
                 <w:noProof/>
                 <w:webHidden/>
               </w:rPr>
-              <w:instrText xml:space="preserve"> PAGEREF _Toc210976419 \h </w:instrText>
+              <w:instrText xml:space="preserve"> PAGEREF _Toc211263262 \h </w:instrText>
             </w:r>
             <w:r>
               <w:rPr>
@@ -1001,7 +1001,7 @@
               <w:noProof/>
             </w:rPr>
           </w:pPr>
-          <w:hyperlink w:anchor="_Toc210976420" w:history="1">
+          <w:hyperlink w:anchor="_Toc211263263" w:history="1">
             <w:r>
               <w:rPr>
                 <w:rStyle w:val="Hyperlink"/>
@@ -1042,7 +1042,7 @@
                 <w:noProof/>
                 <w:webHidden/>
               </w:rPr>
-              <w:instrText xml:space="preserve"> PAGEREF _Toc210976420 \h </w:instrText>
+              <w:instrText xml:space="preserve"> PAGEREF _Toc211263263 \h </w:instrText>
             </w:r>
             <w:r>
               <w:rPr>
@@ -1085,7 +1085,7 @@
               <w:noProof/>
             </w:rPr>
           </w:pPr>
-          <w:hyperlink w:anchor="_Toc210976421" w:history="1">
+          <w:hyperlink w:anchor="_Toc211263264" w:history="1">
             <w:r>
               <w:rPr>
                 <w:rStyle w:val="Hyperlink"/>
@@ -1126,7 +1126,7 @@
                 <w:noProof/>
                 <w:webHidden/>
               </w:rPr>
-              <w:instrText xml:space="preserve"> PAGEREF _Toc210976421 \h </w:instrText>
+              <w:instrText xml:space="preserve"> PAGEREF _Toc211263264 \h </w:instrText>
             </w:r>
             <w:r>
               <w:rPr>
@@ -1169,7 +1169,7 @@
               <w:noProof/>
             </w:rPr>
           </w:pPr>
-          <w:hyperlink w:anchor="_Toc210976422" w:history="1">
+          <w:hyperlink w:anchor="_Toc211263265" w:history="1">
             <w:r>
               <w:rPr>
                 <w:rStyle w:val="Hyperlink"/>
@@ -1210,7 +1210,7 @@
                 <w:noProof/>
                 <w:webHidden/>
               </w:rPr>
-              <w:instrText xml:space="preserve"> PAGEREF _Toc210976422 \h </w:instrText>
+              <w:instrText xml:space="preserve"> PAGEREF _Toc211263265 \h </w:instrText>
             </w:r>
             <w:r>
               <w:rPr>
@@ -1253,7 +1253,7 @@
               <w:noProof/>
             </w:rPr>
           </w:pPr>
-          <w:hyperlink w:anchor="_Toc210976423" w:history="1">
+          <w:hyperlink w:anchor="_Toc211263266" w:history="1">
             <w:r>
               <w:rPr>
                 <w:rStyle w:val="Hyperlink"/>
@@ -1294,7 +1294,7 @@
                 <w:noProof/>
                 <w:webHidden/>
               </w:rPr>
-              <w:instrText xml:space="preserve"> PAGEREF _Toc210976423 \h </w:instrText>
+              <w:instrText xml:space="preserve"> PAGEREF _Toc211263266 \h </w:instrText>
             </w:r>
             <w:r>
               <w:rPr>
@@ -1337,7 +1337,7 @@
               <w:noProof/>
             </w:rPr>
           </w:pPr>
-          <w:hyperlink w:anchor="_Toc210976424" w:history="1">
+          <w:hyperlink w:anchor="_Toc211263267" w:history="1">
             <w:r>
               <w:rPr>
                 <w:rStyle w:val="Hyperlink"/>
@@ -1378,7 +1378,7 @@
                 <w:noProof/>
                 <w:webHidden/>
               </w:rPr>
-              <w:instrText xml:space="preserve"> PAGEREF _Toc210976424 \h </w:instrText>
+              <w:instrText xml:space="preserve"> PAGEREF _Toc211263267 \h </w:instrText>
             </w:r>
             <w:r>
               <w:rPr>
@@ -1421,7 +1421,7 @@
               <w:noProof/>
             </w:rPr>
           </w:pPr>
-          <w:hyperlink w:anchor="_Toc210976425" w:history="1">
+          <w:hyperlink w:anchor="_Toc211263268" w:history="1">
             <w:r>
               <w:rPr>
                 <w:rStyle w:val="Hyperlink"/>
@@ -1462,7 +1462,7 @@
                 <w:noProof/>
                 <w:webHidden/>
               </w:rPr>
-              <w:instrText xml:space="preserve"> PAGEREF _Toc210976425 \h </w:instrText>
+              <w:instrText xml:space="preserve"> PAGEREF _Toc211263268 \h </w:instrText>
             </w:r>
             <w:r>
               <w:rPr>
@@ -1505,7 +1505,7 @@
               <w:noProof/>
             </w:rPr>
           </w:pPr>
-          <w:hyperlink w:anchor="_Toc210976426" w:history="1">
+          <w:hyperlink w:anchor="_Toc211263269" w:history="1">
             <w:r>
               <w:rPr>
                 <w:rStyle w:val="Hyperlink"/>
@@ -1546,7 +1546,7 @@
                 <w:noProof/>
                 <w:webHidden/>
               </w:rPr>
-              <w:instrText xml:space="preserve"> PAGEREF _Toc210976426 \h </w:instrText>
+              <w:instrText xml:space="preserve"> PAGEREF _Toc211263269 \h </w:instrText>
             </w:r>
             <w:r>
               <w:rPr>
@@ -1589,7 +1589,7 @@
               <w:noProof/>
             </w:rPr>
           </w:pPr>
-          <w:hyperlink w:anchor="_Toc210976427" w:history="1">
+          <w:hyperlink w:anchor="_Toc211263270" w:history="1">
             <w:r>
               <w:rPr>
                 <w:rStyle w:val="Hyperlink"/>
@@ -1630,7 +1630,7 @@
                 <w:noProof/>
                 <w:webHidden/>
               </w:rPr>
-              <w:instrText xml:space="preserve"> PAGEREF _Toc210976427 \h </w:instrText>
+              <w:instrText xml:space="preserve"> PAGEREF _Toc211263270 \h </w:instrText>
             </w:r>
             <w:r>
               <w:rPr>
@@ -1673,7 +1673,7 @@
               <w:noProof/>
             </w:rPr>
           </w:pPr>
-          <w:hyperlink w:anchor="_Toc210976428" w:history="1">
+          <w:hyperlink w:anchor="_Toc211263271" w:history="1">
             <w:r>
               <w:rPr>
                 <w:rStyle w:val="Hyperlink"/>
@@ -1714,7 +1714,7 @@
                 <w:noProof/>
                 <w:webHidden/>
               </w:rPr>
-              <w:instrText xml:space="preserve"> PAGEREF _Toc210976428 \h </w:instrText>
+              <w:instrText xml:space="preserve"> PAGEREF _Toc211263271 \h </w:instrText>
             </w:r>
             <w:r>
               <w:rPr>
@@ -1757,7 +1757,7 @@
               <w:noProof/>
             </w:rPr>
           </w:pPr>
-          <w:hyperlink w:anchor="_Toc210976429" w:history="1">
+          <w:hyperlink w:anchor="_Toc211263272" w:history="1">
             <w:r>
               <w:rPr>
                 <w:rStyle w:val="Hyperlink"/>
@@ -1798,7 +1798,7 @@
                 <w:noProof/>
                 <w:webHidden/>
               </w:rPr>
-              <w:instrText xml:space="preserve"> PAGEREF _Toc210976429 \h </w:instrText>
+              <w:instrText xml:space="preserve"> PAGEREF _Toc211263272 \h </w:instrText>
             </w:r>
             <w:r>
               <w:rPr>
@@ -1841,7 +1841,7 @@
               <w:noProof/>
             </w:rPr>
           </w:pPr>
-          <w:hyperlink w:anchor="_Toc210976430" w:history="1">
+          <w:hyperlink w:anchor="_Toc211263273" w:history="1">
             <w:r>
               <w:rPr>
                 <w:rStyle w:val="Hyperlink"/>
@@ -1882,7 +1882,7 @@
                 <w:noProof/>
                 <w:webHidden/>
               </w:rPr>
-              <w:instrText xml:space="preserve"> PAGEREF _Toc210976430 \h </w:instrText>
+              <w:instrText xml:space="preserve"> PAGEREF _Toc211263273 \h </w:instrText>
             </w:r>
             <w:r>
               <w:rPr>
@@ -1925,7 +1925,7 @@
               <w:noProof/>
             </w:rPr>
           </w:pPr>
-          <w:hyperlink w:anchor="_Toc210976431" w:history="1">
+          <w:hyperlink w:anchor="_Toc211263274" w:history="1">
             <w:r>
               <w:rPr>
                 <w:rStyle w:val="Hyperlink"/>
@@ -1966,7 +1966,7 @@
                 <w:noProof/>
                 <w:webHidden/>
               </w:rPr>
-              <w:instrText xml:space="preserve"> PAGEREF _Toc210976431 \h </w:instrText>
+              <w:instrText xml:space="preserve"> PAGEREF _Toc211263274 \h </w:instrText>
             </w:r>
             <w:r>
               <w:rPr>
@@ -2009,7 +2009,7 @@
               <w:noProof/>
             </w:rPr>
           </w:pPr>
-          <w:hyperlink w:anchor="_Toc210976432" w:history="1">
+          <w:hyperlink w:anchor="_Toc211263275" w:history="1">
             <w:r>
               <w:rPr>
                 <w:rStyle w:val="Hyperlink"/>
@@ -2050,7 +2050,7 @@
                 <w:noProof/>
                 <w:webHidden/>
               </w:rPr>
-              <w:instrText xml:space="preserve"> PAGEREF _Toc210976432 \h </w:instrText>
+              <w:instrText xml:space="preserve"> PAGEREF _Toc211263275 \h </w:instrText>
             </w:r>
             <w:r>
               <w:rPr>
@@ -2093,7 +2093,7 @@
               <w:noProof/>
             </w:rPr>
           </w:pPr>
-          <w:hyperlink w:anchor="_Toc210976433" w:history="1">
+          <w:hyperlink w:anchor="_Toc211263276" w:history="1">
             <w:r>
               <w:rPr>
                 <w:rStyle w:val="Hyperlink"/>
@@ -2134,7 +2134,7 @@
                 <w:noProof/>
                 <w:webHidden/>
               </w:rPr>
-              <w:instrText xml:space="preserve"> PAGEREF _Toc210976433 \h </w:instrText>
+              <w:instrText xml:space="preserve"> PAGEREF _Toc211263276 \h </w:instrText>
             </w:r>
             <w:r>
               <w:rPr>
@@ -2177,7 +2177,7 @@
               <w:noProof/>
             </w:rPr>
           </w:pPr>
-          <w:hyperlink w:anchor="_Toc210976434" w:history="1">
+          <w:hyperlink w:anchor="_Toc211263277" w:history="1">
             <w:r>
               <w:rPr>
                 <w:rStyle w:val="Hyperlink"/>
@@ -2218,7 +2218,7 @@
                 <w:noProof/>
                 <w:webHidden/>
               </w:rPr>
-              <w:instrText xml:space="preserve"> PAGEREF _Toc210976434 \h </w:instrText>
+              <w:instrText xml:space="preserve"> PAGEREF _Toc211263277 \h </w:instrText>
             </w:r>
             <w:r>
               <w:rPr>
@@ -2261,7 +2261,7 @@
               <w:noProof/>
             </w:rPr>
           </w:pPr>
-          <w:hyperlink w:anchor="_Toc210976435" w:history="1">
+          <w:hyperlink w:anchor="_Toc211263278" w:history="1">
             <w:r>
               <w:rPr>
                 <w:rStyle w:val="Hyperlink"/>
@@ -2302,7 +2302,7 @@
                 <w:noProof/>
                 <w:webHidden/>
               </w:rPr>
-              <w:instrText xml:space="preserve"> PAGEREF _Toc210976435 \h </w:instrText>
+              <w:instrText xml:space="preserve"> PAGEREF _Toc211263278 \h </w:instrText>
             </w:r>
             <w:r>
               <w:rPr>
@@ -2345,7 +2345,7 @@
               <w:noProof/>
             </w:rPr>
           </w:pPr>
-          <w:hyperlink w:anchor="_Toc210976436" w:history="1">
+          <w:hyperlink w:anchor="_Toc211263279" w:history="1">
             <w:r>
               <w:rPr>
                 <w:rStyle w:val="Hyperlink"/>
@@ -2386,7 +2386,7 @@
                 <w:noProof/>
                 <w:webHidden/>
               </w:rPr>
-              <w:instrText xml:space="preserve"> PAGEREF _Toc210976436 \h </w:instrText>
+              <w:instrText xml:space="preserve"> PAGEREF _Toc211263279 \h </w:instrText>
             </w:r>
             <w:r>
               <w:rPr>
@@ -2429,7 +2429,7 @@
               <w:noProof/>
             </w:rPr>
           </w:pPr>
-          <w:hyperlink w:anchor="_Toc210976437" w:history="1">
+          <w:hyperlink w:anchor="_Toc211263280" w:history="1">
             <w:r>
               <w:rPr>
                 <w:rStyle w:val="Hyperlink"/>
@@ -2470,7 +2470,7 @@
                 <w:noProof/>
                 <w:webHidden/>
               </w:rPr>
-              <w:instrText xml:space="preserve"> PAGEREF _Toc210976437 \h </w:instrText>
+              <w:instrText xml:space="preserve"> PAGEREF _Toc211263280 \h </w:instrText>
             </w:r>
             <w:r>
               <w:rPr>
@@ -2513,7 +2513,7 @@
               <w:noProof/>
             </w:rPr>
           </w:pPr>
-          <w:hyperlink w:anchor="_Toc210976438" w:history="1">
+          <w:hyperlink w:anchor="_Toc211263281" w:history="1">
             <w:r>
               <w:rPr>
                 <w:rStyle w:val="Hyperlink"/>
@@ -2554,7 +2554,7 @@
                 <w:noProof/>
                 <w:webHidden/>
               </w:rPr>
-              <w:instrText xml:space="preserve"> PAGEREF _Toc210976438 \h </w:instrText>
+              <w:instrText xml:space="preserve"> PAGEREF _Toc211263281 \h </w:instrText>
             </w:r>
             <w:r>
               <w:rPr>
@@ -2597,7 +2597,7 @@
               <w:noProof/>
             </w:rPr>
           </w:pPr>
-          <w:hyperlink w:anchor="_Toc210976439" w:history="1">
+          <w:hyperlink w:anchor="_Toc211263282" w:history="1">
             <w:r>
               <w:rPr>
                 <w:rStyle w:val="Hyperlink"/>
@@ -2638,7 +2638,7 @@
                 <w:noProof/>
                 <w:webHidden/>
               </w:rPr>
-              <w:instrText xml:space="preserve"> PAGEREF _Toc210976439 \h </w:instrText>
+              <w:instrText xml:space="preserve"> PAGEREF _Toc211263282 \h </w:instrText>
             </w:r>
             <w:r>
               <w:rPr>
@@ -2681,7 +2681,7 @@
               <w:noProof/>
             </w:rPr>
           </w:pPr>
-          <w:hyperlink w:anchor="_Toc210976440" w:history="1">
+          <w:hyperlink w:anchor="_Toc211263283" w:history="1">
             <w:r>
               <w:rPr>
                 <w:rStyle w:val="Hyperlink"/>
@@ -2722,7 +2722,7 @@
                 <w:noProof/>
                 <w:webHidden/>
               </w:rPr>
-              <w:instrText xml:space="preserve"> PAGEREF _Toc210976440 \h </w:instrText>
+              <w:instrText xml:space="preserve"> PAGEREF _Toc211263283 \h </w:instrText>
             </w:r>
             <w:r>
               <w:rPr>
@@ -2765,7 +2765,7 @@
               <w:noProof/>
             </w:rPr>
           </w:pPr>
-          <w:hyperlink w:anchor="_Toc210976441" w:history="1">
+          <w:hyperlink w:anchor="_Toc211263284" w:history="1">
             <w:r>
               <w:rPr>
                 <w:rStyle w:val="Hyperlink"/>
@@ -2806,7 +2806,7 @@
                 <w:noProof/>
                 <w:webHidden/>
               </w:rPr>
-              <w:instrText xml:space="preserve"> PAGEREF _Toc210976441 \h </w:instrText>
+              <w:instrText xml:space="preserve"> PAGEREF _Toc211263284 \h </w:instrText>
             </w:r>
             <w:r>
               <w:rPr>
@@ -2849,7 +2849,7 @@
               <w:noProof/>
             </w:rPr>
           </w:pPr>
-          <w:hyperlink w:anchor="_Toc210976442" w:history="1">
+          <w:hyperlink w:anchor="_Toc211263285" w:history="1">
             <w:r>
               <w:rPr>
                 <w:rStyle w:val="Hyperlink"/>
@@ -2890,7 +2890,7 @@
                 <w:noProof/>
                 <w:webHidden/>
               </w:rPr>
-              <w:instrText xml:space="preserve"> PAGEREF _Toc210976442 \h </w:instrText>
+              <w:instrText xml:space="preserve"> PAGEREF _Toc211263285 \h </w:instrText>
             </w:r>
             <w:r>
               <w:rPr>
@@ -2933,7 +2933,7 @@
               <w:noProof/>
             </w:rPr>
           </w:pPr>
-          <w:hyperlink w:anchor="_Toc210976443" w:history="1">
+          <w:hyperlink w:anchor="_Toc211263286" w:history="1">
             <w:r>
               <w:rPr>
                 <w:rStyle w:val="Hyperlink"/>
@@ -2974,7 +2974,7 @@
                 <w:noProof/>
                 <w:webHidden/>
               </w:rPr>
-              <w:instrText xml:space="preserve"> PAGEREF _Toc210976443 \h </w:instrText>
+              <w:instrText xml:space="preserve"> PAGEREF _Toc211263286 \h </w:instrText>
             </w:r>
             <w:r>
               <w:rPr>
@@ -3017,7 +3017,7 @@
               <w:noProof/>
             </w:rPr>
           </w:pPr>
-          <w:hyperlink w:anchor="_Toc210976444" w:history="1">
+          <w:hyperlink w:anchor="_Toc211263287" w:history="1">
             <w:r>
               <w:rPr>
                 <w:rStyle w:val="Hyperlink"/>
@@ -3058,7 +3058,7 @@
                 <w:noProof/>
                 <w:webHidden/>
               </w:rPr>
-              <w:instrText xml:space="preserve"> PAGEREF _Toc210976444 \h </w:instrText>
+              <w:instrText xml:space="preserve"> PAGEREF _Toc211263287 \h </w:instrText>
             </w:r>
             <w:r>
               <w:rPr>
@@ -3101,7 +3101,7 @@
               <w:noProof/>
             </w:rPr>
           </w:pPr>
-          <w:hyperlink w:anchor="_Toc210976445" w:history="1">
+          <w:hyperlink w:anchor="_Toc211263288" w:history="1">
             <w:r>
               <w:rPr>
                 <w:rStyle w:val="Hyperlink"/>
@@ -3142,7 +3142,7 @@
                 <w:noProof/>
                 <w:webHidden/>
               </w:rPr>
-              <w:instrText xml:space="preserve"> PAGEREF _Toc210976445 \h </w:instrText>
+              <w:instrText xml:space="preserve"> PAGEREF _Toc211263288 \h </w:instrText>
             </w:r>
             <w:r>
               <w:rPr>
@@ -3185,7 +3185,7 @@
               <w:noProof/>
             </w:rPr>
           </w:pPr>
-          <w:hyperlink w:anchor="_Toc210976446" w:history="1">
+          <w:hyperlink w:anchor="_Toc211263289" w:history="1">
             <w:r>
               <w:rPr>
                 <w:rStyle w:val="Hyperlink"/>
@@ -3226,7 +3226,7 @@
                 <w:noProof/>
                 <w:webHidden/>
               </w:rPr>
-              <w:instrText xml:space="preserve"> PAGEREF _Toc210976446 \h </w:instrText>
+              <w:instrText xml:space="preserve"> PAGEREF _Toc211263289 \h </w:instrText>
             </w:r>
             <w:r>
               <w:rPr>
@@ -3269,7 +3269,7 @@
               <w:noProof/>
             </w:rPr>
           </w:pPr>
-          <w:hyperlink w:anchor="_Toc210976447" w:history="1">
+          <w:hyperlink w:anchor="_Toc211263290" w:history="1">
             <w:r>
               <w:rPr>
                 <w:rStyle w:val="Hyperlink"/>
@@ -3310,7 +3310,7 @@
                 <w:noProof/>
                 <w:webHidden/>
               </w:rPr>
-              <w:instrText xml:space="preserve"> PAGEREF _Toc210976447 \h </w:instrText>
+              <w:instrText xml:space="preserve"> PAGEREF _Toc211263290 \h </w:instrText>
             </w:r>
             <w:r>
               <w:rPr>
@@ -3353,7 +3353,7 @@
               <w:noProof/>
             </w:rPr>
           </w:pPr>
-          <w:hyperlink w:anchor="_Toc210976448" w:history="1">
+          <w:hyperlink w:anchor="_Toc211263291" w:history="1">
             <w:r>
               <w:rPr>
                 <w:rStyle w:val="Hyperlink"/>
@@ -3394,7 +3394,7 @@
                 <w:noProof/>
                 <w:webHidden/>
               </w:rPr>
-              <w:instrText xml:space="preserve"> PAGEREF _Toc210976448 \h </w:instrText>
+              <w:instrText xml:space="preserve"> PAGEREF _Toc211263291 \h </w:instrText>
             </w:r>
             <w:r>
               <w:rPr>
@@ -3437,7 +3437,7 @@
               <w:noProof/>
             </w:rPr>
           </w:pPr>
-          <w:hyperlink w:anchor="_Toc210976449" w:history="1">
+          <w:hyperlink w:anchor="_Toc211263292" w:history="1">
             <w:r>
               <w:rPr>
                 <w:rStyle w:val="Hyperlink"/>
@@ -3478,7 +3478,7 @@
                 <w:noProof/>
                 <w:webHidden/>
               </w:rPr>
-              <w:instrText xml:space="preserve"> PAGEREF _Toc210976449 \h </w:instrText>
+              <w:instrText xml:space="preserve"> PAGEREF _Toc211263292 \h </w:instrText>
             </w:r>
             <w:r>
               <w:rPr>
@@ -3521,7 +3521,7 @@
               <w:noProof/>
             </w:rPr>
           </w:pPr>
-          <w:hyperlink w:anchor="_Toc210976450" w:history="1">
+          <w:hyperlink w:anchor="_Toc211263293" w:history="1">
             <w:r>
               <w:rPr>
                 <w:rStyle w:val="Hyperlink"/>
@@ -3562,7 +3562,7 @@
                 <w:noProof/>
                 <w:webHidden/>
               </w:rPr>
-              <w:instrText xml:space="preserve"> PAGEREF _Toc210976450 \h </w:instrText>
+              <w:instrText xml:space="preserve"> PAGEREF _Toc211263293 \h </w:instrText>
             </w:r>
             <w:r>
               <w:rPr>
@@ -3605,7 +3605,7 @@
               <w:noProof/>
             </w:rPr>
           </w:pPr>
-          <w:hyperlink w:anchor="_Toc210976451" w:history="1">
+          <w:hyperlink w:anchor="_Toc211263294" w:history="1">
             <w:r>
               <w:rPr>
                 <w:rStyle w:val="Hyperlink"/>
@@ -3646,7 +3646,7 @@
                 <w:noProof/>
                 <w:webHidden/>
               </w:rPr>
-              <w:instrText xml:space="preserve"> PAGEREF _Toc210976451 \h </w:instrText>
+              <w:instrText xml:space="preserve"> PAGEREF _Toc211263294 \h </w:instrText>
             </w:r>
             <w:r>
               <w:rPr>
@@ -3689,7 +3689,7 @@
               <w:noProof/>
             </w:rPr>
           </w:pPr>
-          <w:hyperlink w:anchor="_Toc210976452" w:history="1">
+          <w:hyperlink w:anchor="_Toc211263295" w:history="1">
             <w:r>
               <w:rPr>
                 <w:rStyle w:val="Hyperlink"/>
@@ -3730,7 +3730,7 @@
                 <w:noProof/>
                 <w:webHidden/>
               </w:rPr>
-              <w:instrText xml:space="preserve"> PAGEREF _Toc210976452 \h </w:instrText>
+              <w:instrText xml:space="preserve"> PAGEREF _Toc211263295 \h </w:instrText>
             </w:r>
             <w:r>
               <w:rPr>
@@ -3790,7 +3790,7 @@
       <w:pPr>
         <w:pStyle w:val="Heading1"/>
       </w:pPr>
-      <w:bookmarkStart w:id="0" w:name="_Toc210976409"/>
+      <w:bookmarkStart w:id="0" w:name="_Toc211263252"/>
       <w:r>
         <w:lastRenderedPageBreak/>
         <w:t>Getting Started</w:t>
@@ -4004,7 +4004,7 @@
       <w:pPr>
         <w:pStyle w:val="Heading1"/>
       </w:pPr>
-      <w:bookmarkStart w:id="1" w:name="_Toc210976410"/>
+      <w:bookmarkStart w:id="1" w:name="_Toc211263253"/>
       <w:r>
         <w:lastRenderedPageBreak/>
         <w:t>System Setup</w:t>
@@ -4019,7 +4019,7 @@
       <w:pPr>
         <w:pStyle w:val="Heading2"/>
       </w:pPr>
-      <w:bookmarkStart w:id="2" w:name="_Toc210976411"/>
+      <w:bookmarkStart w:id="2" w:name="_Toc211263254"/>
       <w:r>
         <w:t>Install Git</w:t>
       </w:r>
@@ -4048,7 +4048,7 @@
       <w:pPr>
         <w:pStyle w:val="Heading2"/>
       </w:pPr>
-      <w:bookmarkStart w:id="3" w:name="_Toc210976412"/>
+      <w:bookmarkStart w:id="3" w:name="_Toc211263255"/>
       <w:r>
         <w:t>Install Python</w:t>
       </w:r>
@@ -4090,7 +4090,7 @@
       <w:pPr>
         <w:pStyle w:val="Heading2"/>
       </w:pPr>
-      <w:bookmarkStart w:id="4" w:name="_Toc210976413"/>
+      <w:bookmarkStart w:id="4" w:name="_Toc211263256"/>
       <w:r>
         <w:t xml:space="preserve">Create </w:t>
       </w:r>
@@ -4140,7 +4140,7 @@
       <w:pPr>
         <w:pStyle w:val="Heading2"/>
       </w:pPr>
-      <w:bookmarkStart w:id="5" w:name="_Toc210976414"/>
+      <w:bookmarkStart w:id="5" w:name="_Toc211263257"/>
       <w:r>
         <w:t>Clone the base FlexRIO repo</w:t>
       </w:r>
@@ -4175,7 +4175,7 @@
       <w:pPr>
         <w:pStyle w:val="Heading2"/>
       </w:pPr>
-      <w:bookmarkStart w:id="6" w:name="_Toc210976415"/>
+      <w:bookmarkStart w:id="6" w:name="_Toc211263258"/>
       <w:r>
         <w:t>Install the LabVIEW FPGA HDL Tools</w:t>
       </w:r>
@@ -4253,7 +4253,7 @@
       <w:pPr>
         <w:pStyle w:val="Heading2"/>
       </w:pPr>
-      <w:bookmarkStart w:id="7" w:name="_Toc210976416"/>
+      <w:bookmarkStart w:id="7" w:name="_Toc211263259"/>
       <w:r>
         <w:lastRenderedPageBreak/>
         <w:t>Install Dependencies</w:t>
@@ -4377,7 +4377,7 @@
       <w:pPr>
         <w:pStyle w:val="Heading2"/>
       </w:pPr>
-      <w:bookmarkStart w:id="8" w:name="_Toc210976417"/>
+      <w:bookmarkStart w:id="8" w:name="_Toc211263260"/>
       <w:r>
         <w:t>Create and Synthesize the Vivado Project</w:t>
       </w:r>
@@ -4517,7 +4517,7 @@
       <w:pPr>
         <w:pStyle w:val="Heading2"/>
       </w:pPr>
-      <w:bookmarkStart w:id="9" w:name="_Toc210976418"/>
+      <w:bookmarkStart w:id="9" w:name="_Toc211263261"/>
       <w:r>
         <w:t>Install LabVIEW Patch</w:t>
       </w:r>
@@ -4620,7 +4620,7 @@
       <w:pPr>
         <w:pStyle w:val="Heading2"/>
       </w:pPr>
-      <w:bookmarkStart w:id="10" w:name="_Toc210976419"/>
+      <w:bookmarkStart w:id="10" w:name="_Toc211263262"/>
       <w:r>
         <w:t>Get the flexrio-custom repo</w:t>
       </w:r>
@@ -4729,7 +4729,7 @@
       <w:pPr>
         <w:pStyle w:val="Heading2"/>
       </w:pPr>
-      <w:bookmarkStart w:id="11" w:name="_Toc210976420"/>
+      <w:bookmarkStart w:id="11" w:name="_Toc211263263"/>
       <w:r>
         <w:t>NI Software</w:t>
       </w:r>
@@ -4787,7 +4787,7 @@
       <w:pPr>
         <w:pStyle w:val="Heading1"/>
       </w:pPr>
-      <w:bookmarkStart w:id="12" w:name="_Toc210976421"/>
+      <w:bookmarkStart w:id="12" w:name="_Toc211263264"/>
       <w:r>
         <w:lastRenderedPageBreak/>
         <w:t>CLIP Migration</w:t>
@@ -5099,7 +5099,7 @@
       <w:pPr>
         <w:pStyle w:val="Heading1"/>
       </w:pPr>
-      <w:bookmarkStart w:id="13" w:name="_Toc210976422"/>
+      <w:bookmarkStart w:id="13" w:name="_Toc211263265"/>
       <w:r>
         <w:lastRenderedPageBreak/>
         <w:t>Customize the PXIe-7903 with Aurora</w:t>
@@ -5111,7 +5111,7 @@
       <w:pPr>
         <w:pStyle w:val="Heading2"/>
       </w:pPr>
-      <w:bookmarkStart w:id="14" w:name="_Toc210976423"/>
+      <w:bookmarkStart w:id="14" w:name="_Toc211263266"/>
       <w:r>
         <w:t>Configure Project Settings INI for CLIP Migration</w:t>
       </w:r>
@@ -6135,7 +6135,7 @@
       <w:pPr>
         <w:pStyle w:val="Heading2"/>
       </w:pPr>
-      <w:bookmarkStart w:id="15" w:name="_Toc210976424"/>
+      <w:bookmarkStart w:id="15" w:name="_Toc211263267"/>
       <w:r>
         <w:lastRenderedPageBreak/>
         <w:t>Run CLIP Migration</w:t>
@@ -6274,7 +6274,7 @@
       <w:pPr>
         <w:pStyle w:val="Heading2"/>
       </w:pPr>
-      <w:bookmarkStart w:id="16" w:name="_Toc210976425"/>
+      <w:bookmarkStart w:id="16" w:name="_Toc211263268"/>
       <w:r>
         <w:t>Modify Board IO CSV</w:t>
       </w:r>
@@ -6964,7 +6964,7 @@
       <w:pPr>
         <w:pStyle w:val="Heading2"/>
       </w:pPr>
-      <w:bookmarkStart w:id="17" w:name="_Toc210976426"/>
+      <w:bookmarkStart w:id="17" w:name="_Toc211263269"/>
       <w:r>
         <w:lastRenderedPageBreak/>
         <w:t>Instantiate</w:t>
@@ -7078,7 +7078,7 @@
       <w:pPr>
         <w:pStyle w:val="Heading3"/>
       </w:pPr>
-      <w:bookmarkStart w:id="18" w:name="_Toc210976427"/>
+      <w:bookmarkStart w:id="18" w:name="_Toc211263270"/>
       <w:r>
         <w:t>Uncomment MGT Port Lines</w:t>
       </w:r>
@@ -7475,7 +7475,7 @@
       <w:pPr>
         <w:pStyle w:val="Heading3"/>
       </w:pPr>
-      <w:bookmarkStart w:id="19" w:name="_Toc210976428"/>
+      <w:bookmarkStart w:id="19" w:name="_Toc211263271"/>
       <w:r>
         <w:lastRenderedPageBreak/>
         <w:t>Generate TheWindow.vhd Stub</w:t>
@@ -7732,7 +7732,7 @@
       <w:pPr>
         <w:pStyle w:val="Heading3"/>
       </w:pPr>
-      <w:bookmarkStart w:id="20" w:name="_Toc210976429"/>
+      <w:bookmarkStart w:id="20" w:name="_Toc211263272"/>
       <w:r>
         <w:t xml:space="preserve">Add Custom Board IO to </w:t>
       </w:r>
@@ -8089,7 +8089,7 @@
       <w:pPr>
         <w:pStyle w:val="Heading3"/>
       </w:pPr>
-      <w:bookmarkStart w:id="21" w:name="_Toc210976430"/>
+      <w:bookmarkStart w:id="21" w:name="_Toc211263273"/>
       <w:r>
         <w:t>Add Custom Board IO Signal Definitions</w:t>
       </w:r>
@@ -8509,7 +8509,7 @@
       <w:pPr>
         <w:pStyle w:val="Heading3"/>
       </w:pPr>
-      <w:bookmarkStart w:id="22" w:name="_Toc210976431"/>
+      <w:bookmarkStart w:id="22" w:name="_Toc211263274"/>
       <w:r>
         <w:t>Add Custom Board IO Signals to</w:t>
       </w:r>
@@ -9190,7 +9190,7 @@
       <w:pPr>
         <w:pStyle w:val="Heading3"/>
       </w:pPr>
-      <w:bookmarkStart w:id="23" w:name="_Toc210976432"/>
+      <w:bookmarkStart w:id="23" w:name="_Toc211263275"/>
       <w:r>
         <w:t xml:space="preserve">Disconnect the CLIP IO Socket Ports on </w:t>
       </w:r>
@@ -11177,7 +11177,7 @@
       <w:pPr>
         <w:pStyle w:val="Heading3"/>
       </w:pPr>
-      <w:bookmarkStart w:id="24" w:name="_Toc210976433"/>
+      <w:bookmarkStart w:id="24" w:name="_Toc211263276"/>
       <w:r>
         <w:t>Instantiate the Aurora CLIP</w:t>
       </w:r>
@@ -11312,7 +11312,7 @@
       <w:pPr>
         <w:pStyle w:val="Heading3"/>
       </w:pPr>
-      <w:bookmarkStart w:id="25" w:name="_Toc210976434"/>
+      <w:bookmarkStart w:id="25" w:name="_Toc211263277"/>
       <w:r>
         <w:t>Modify Aurora CLIP Signals</w:t>
       </w:r>
@@ -12964,7 +12964,7 @@
       <w:pPr>
         <w:pStyle w:val="Heading3"/>
       </w:pPr>
-      <w:bookmarkStart w:id="26" w:name="_Toc210976435"/>
+      <w:bookmarkStart w:id="26" w:name="_Toc211263278"/>
       <w:r>
         <w:t>(Optional) Compare Against FlexRIO-Custom example</w:t>
       </w:r>
@@ -12996,7 +12996,7 @@
       <w:pPr>
         <w:pStyle w:val="Heading2"/>
       </w:pPr>
-      <w:bookmarkStart w:id="27" w:name="_Toc210976436"/>
+      <w:bookmarkStart w:id="27" w:name="_Toc211263279"/>
       <w:r>
         <w:t>Copy</w:t>
       </w:r>
@@ -13235,7 +13235,7 @@
       <w:pPr>
         <w:pStyle w:val="Heading2"/>
       </w:pPr>
-      <w:bookmarkStart w:id="28" w:name="_Toc210976437"/>
+      <w:bookmarkStart w:id="28" w:name="_Toc211263280"/>
       <w:r>
         <w:t>Add the CLIP HDL to the Vivado Project Sources</w:t>
       </w:r>
@@ -13644,7 +13644,7 @@
       <w:pPr>
         <w:pStyle w:val="Heading2"/>
       </w:pPr>
-      <w:bookmarkStart w:id="29" w:name="_Toc210976438"/>
+      <w:bookmarkStart w:id="29" w:name="_Toc211263281"/>
       <w:r>
         <w:t>Synthesize the Customized FPGA Target</w:t>
       </w:r>
@@ -13831,7 +13831,7 @@
       <w:pPr>
         <w:pStyle w:val="Heading2"/>
       </w:pPr>
-      <w:bookmarkStart w:id="30" w:name="_Toc210976439"/>
+      <w:bookmarkStart w:id="30" w:name="_Toc211263282"/>
       <w:r>
         <w:t>Create Custom LabVIEW FPGA Target</w:t>
       </w:r>
@@ -13841,7 +13841,7 @@
       <w:pPr>
         <w:pStyle w:val="Heading3"/>
       </w:pPr>
-      <w:bookmarkStart w:id="31" w:name="_Toc210976440"/>
+      <w:bookmarkStart w:id="31" w:name="_Toc211263283"/>
       <w:r>
         <w:t xml:space="preserve">Modify </w:t>
       </w:r>
@@ -14010,7 +14010,7 @@
       <w:pPr>
         <w:pStyle w:val="Heading3"/>
       </w:pPr>
-      <w:bookmarkStart w:id="32" w:name="_Toc210976441"/>
+      <w:bookmarkStart w:id="32" w:name="_Toc211263284"/>
       <w:r>
         <w:lastRenderedPageBreak/>
         <w:t>Generate and Install the Custom Target</w:t>
@@ -14146,7 +14146,7 @@
       <w:pPr>
         <w:pStyle w:val="Heading2"/>
       </w:pPr>
-      <w:bookmarkStart w:id="33" w:name="_Toc210976442"/>
+      <w:bookmarkStart w:id="33" w:name="_Toc211263285"/>
       <w:r>
         <w:t>Create the</w:t>
       </w:r>
@@ -14165,7 +14165,7 @@
       <w:pPr>
         <w:pStyle w:val="Heading3"/>
       </w:pPr>
-      <w:bookmarkStart w:id="34" w:name="_Toc210976443"/>
+      <w:bookmarkStart w:id="34" w:name="_Toc211263286"/>
       <w:r>
         <w:t>Create a LabVIEW FPGA project for the new custom target</w:t>
       </w:r>
@@ -14343,7 +14343,7 @@
       <w:pPr>
         <w:pStyle w:val="Heading3"/>
       </w:pPr>
-      <w:bookmarkStart w:id="35" w:name="_Toc210976444"/>
+      <w:bookmarkStart w:id="35" w:name="_Toc211263287"/>
       <w:r>
         <w:lastRenderedPageBreak/>
         <w:t>Create the Aurora Shipping Example Project for the PXIe-7903</w:t>
@@ -14474,7 +14474,7 @@
       <w:pPr>
         <w:pStyle w:val="Heading3"/>
       </w:pPr>
-      <w:bookmarkStart w:id="36" w:name="_Toc210976445"/>
+      <w:bookmarkStart w:id="36" w:name="_Toc211263288"/>
       <w:r>
         <w:t>Copy</w:t>
       </w:r>
@@ -14651,7 +14651,7 @@
       <w:pPr>
         <w:pStyle w:val="Heading3"/>
       </w:pPr>
-      <w:bookmarkStart w:id="37" w:name="_Toc210976446"/>
+      <w:bookmarkStart w:id="37" w:name="_Toc211263289"/>
       <w:r>
         <w:t>Add the Dummy CLIP</w:t>
       </w:r>
@@ -14897,7 +14897,7 @@
       <w:pPr>
         <w:pStyle w:val="Heading2"/>
       </w:pPr>
-      <w:bookmarkStart w:id="38" w:name="_Toc210976447"/>
+      <w:bookmarkStart w:id="38" w:name="_Toc211263290"/>
       <w:r>
         <w:lastRenderedPageBreak/>
         <w:t>Modify the FPGA VI IO Constants</w:t>
@@ -15284,7 +15284,7 @@
       <w:pPr>
         <w:pStyle w:val="Heading2"/>
       </w:pPr>
-      <w:bookmarkStart w:id="39" w:name="_Toc210976448"/>
+      <w:bookmarkStart w:id="39" w:name="_Toc211263291"/>
       <w:r>
         <w:t>Export LabVIEW FPGA Window Netlist</w:t>
       </w:r>
@@ -15310,7 +15310,7 @@
       <w:pPr>
         <w:pStyle w:val="Heading3"/>
       </w:pPr>
-      <w:bookmarkStart w:id="40" w:name="_Toc210976449"/>
+      <w:bookmarkStart w:id="40" w:name="_Toc211263292"/>
       <w:r>
         <w:t>Vivado Project Export</w:t>
       </w:r>
@@ -15383,7 +15383,7 @@
       <w:pPr>
         <w:pStyle w:val="Heading3"/>
       </w:pPr>
-      <w:bookmarkStart w:id="41" w:name="_Toc210976450"/>
+      <w:bookmarkStart w:id="41" w:name="_Toc211263293"/>
       <w:r>
         <w:t>Get the Netlist for The Window</w:t>
       </w:r>
@@ -15644,6 +15644,19 @@
     <w:p/>
     <w:p>
       <w:r>
+        <w:rPr>
+          <w:b/>
+          <w:bCs/>
+        </w:rPr>
+        <w:t>NOTE:</w:t>
+      </w:r>
+      <w:r>
+        <w:t xml:space="preserve"> Vivado has trouble when the project’s folder path is over 80 characters.  The script checks for this and may throw a long-path error.  If you are using the example that is in the flexrio-custom repo documents folder, the default location of the Vivado Project Export folder will likely create a long path.  You can simply move the Vivado Project Export folder to a shorter path before setting the INI setting.</w:t>
+      </w:r>
+    </w:p>
+    <w:p/>
+    <w:p>
+      <w:r>
         <w:t>At the command prompt, run the get-window command:</w:t>
       </w:r>
     </w:p>
@@ -15688,7 +15701,7 @@
       <w:pPr>
         <w:pStyle w:val="Heading2"/>
       </w:pPr>
-      <w:bookmarkStart w:id="42" w:name="_Toc210976451"/>
+      <w:bookmarkStart w:id="42" w:name="_Toc211263294"/>
       <w:r>
         <w:t>Build Custom FPGA Bitfile in Vivado</w:t>
       </w:r>
@@ -15921,7 +15934,6 @@
           <w:sz w:val="22"/>
           <w:szCs w:val="22"/>
         </w:rPr>
-        <w:lastRenderedPageBreak/>
         <w:t>nihdl</w:t>
       </w:r>
       <w:proofErr w:type="spellEnd"/>
@@ -16129,7 +16141,7 @@
       <w:pPr>
         <w:pStyle w:val="Heading2"/>
       </w:pPr>
-      <w:bookmarkStart w:id="43" w:name="_Toc210976452"/>
+      <w:bookmarkStart w:id="43" w:name="_Toc211263295"/>
       <w:r>
         <w:t>Run the Host example</w:t>
       </w:r>
@@ -17734,6 +17746,7 @@
   <w:style w:type="character" w:default="1" w:styleId="DefaultParagraphFont">
     <w:name w:val="Default Paragraph Font"/>
     <w:uiPriority w:val="1"/>
+    <w:semiHidden/>
     <w:unhideWhenUsed/>
   </w:style>
   <w:style w:type="table" w:default="1" w:styleId="TableNormal">

</xml_diff>